<commit_message>
Atualiza documentação de testes e testes automatizados da API SGVC
</commit_message>
<xml_diff>
--- a/Documentação/Relatório_de_Sessão_Funcionalidade_Login_Empreendedores_SGVC.docx
+++ b/Documentação/Relatório_de_Sessão_Funcionalidade_Login_Empreendedores_SGVC.docx
@@ -71,7 +71,7 @@
           <w:szCs w:val="24"/>
         </w:rPr>
         <w:drawing>
-          <wp:inline distT="0" distB="0" distL="0" distR="0" wp14:anchorId="01F427D7" wp14:editId="1407CC05">
+          <wp:inline distT="0" distB="0" distL="0" distR="0" wp14:anchorId="01F427D7" wp14:editId="2BC83253">
             <wp:extent cx="5761355" cy="1440180"/>
             <wp:effectExtent l="0" t="0" r="0" b="7620"/>
             <wp:docPr id="21" name="Imagem 21" descr="Interface gráfica do usuário, Texto, Site&#10;&#10;O conteúdo gerado por IA pode estar incorreto."/>
@@ -794,82 +794,271 @@
         <w:t>Notas*:</w:t>
       </w:r>
     </w:p>
-    <w:p>
-      <w:pPr>
-        <w:pStyle w:val="PargrafodaLista"/>
-        <w:rPr>
-          <w:b/>
-          <w:bCs/>
-        </w:rPr>
-      </w:pPr>
-    </w:p>
-    <w:p>
-      <w:pPr>
-        <w:pStyle w:val="PargrafodaLista"/>
-        <w:numPr>
-          <w:ilvl w:val="0"/>
-          <w:numId w:val="16"/>
-        </w:numPr>
-      </w:pPr>
-      <w:r>
-        <w:t>(I) Observei um comportamento inesperado durante a execução, que pode indicar inconsistência no processamento ou apresentação das informações ao usuário.</w:t>
-      </w:r>
-    </w:p>
-    <w:p>
-      <w:pPr>
-        <w:pStyle w:val="PargrafodaLista"/>
-        <w:numPr>
-          <w:ilvl w:val="0"/>
-          <w:numId w:val="16"/>
-        </w:numPr>
-      </w:pPr>
-      <w:r>
-        <w:t>(I) Percebi ausência de feedback imediato após uma ação, o que pode gerar dúvida sobre a conclusão da operação.</w:t>
-      </w:r>
-    </w:p>
-    <w:p>
-      <w:pPr>
-        <w:pStyle w:val="PargrafodaLista"/>
-        <w:numPr>
-          <w:ilvl w:val="0"/>
-          <w:numId w:val="16"/>
-        </w:numPr>
-      </w:pPr>
-      <w:r>
-        <w:t>(R) Caso o sistema não apresente mudanças claras após uma ação crítica, usuários podem repetir procedimentos indevidamente, gerando falhas, inconsistências ou sobrecarga.</w:t>
-      </w:r>
-    </w:p>
-    <w:p>
-      <w:pPr>
-        <w:pStyle w:val="PargrafodaLista"/>
-        <w:numPr>
-          <w:ilvl w:val="0"/>
-          <w:numId w:val="16"/>
-        </w:numPr>
-      </w:pPr>
-      <w:r>
-        <w:t>(I) Identifiquei um ponto onde a execução não completou conforme esperado, sugerindo possível interrupção ou falha de tratamento.</w:t>
-      </w:r>
-    </w:p>
-    <w:p>
-      <w:pPr>
-        <w:pStyle w:val="PargrafodaLista"/>
-        <w:numPr>
-          <w:ilvl w:val="0"/>
-          <w:numId w:val="16"/>
-        </w:numPr>
-      </w:pPr>
-      <w:r>
-        <w:t>(*) Podem ser (I)nformações relevantes ou (R)iscos observados.</w:t>
-      </w:r>
-    </w:p>
-    <w:p>
-      <w:pPr>
-        <w:rPr>
-          <w:b/>
-          <w:bCs/>
-        </w:rPr>
-      </w:pPr>
+    <w:p/>
+    <w:p>
+      <w:pPr>
+        <w:numPr>
+          <w:ilvl w:val="0"/>
+          <w:numId w:val="21"/>
+        </w:numPr>
+      </w:pPr>
+      <w:r>
+        <w:t>(I) Login aceita credenciais inválidas com mensagem genérica; risco de confundir usuário e dificultar suporte.</w:t>
+      </w:r>
+    </w:p>
+    <w:p>
+      <w:pPr>
+        <w:numPr>
+          <w:ilvl w:val="0"/>
+          <w:numId w:val="21"/>
+        </w:numPr>
+      </w:pPr>
+      <w:r>
+        <w:t>(I) Ausência de feedback imediato em tentativas de login (ex.: sem spinner/estado), gerando dúvida se a requisição foi enviada.</w:t>
+      </w:r>
+    </w:p>
+    <w:p>
+      <w:pPr>
+        <w:numPr>
+          <w:ilvl w:val="0"/>
+          <w:numId w:val="21"/>
+        </w:numPr>
+      </w:pPr>
+      <w:r>
+        <w:t>(R) Após erro, não há sinal claro de bloqueio temporário; usuário pode repetir várias vezes e acionar rate limit ou bloqueio de conta.</w:t>
+      </w:r>
+    </w:p>
+    <w:p>
+      <w:pPr>
+        <w:numPr>
+          <w:ilvl w:val="0"/>
+          <w:numId w:val="21"/>
+        </w:numPr>
+      </w:pPr>
+      <w:r>
+        <w:t>(I) Sessão/token pode expirar sem aviso; tentativa seguinte falha sem mensagem clara de “sessão expirada”.</w:t>
+      </w:r>
+    </w:p>
+    <w:p>
+      <w:pPr>
+        <w:numPr>
+          <w:ilvl w:val="0"/>
+          <w:numId w:val="21"/>
+        </w:numPr>
+      </w:pPr>
+      <w:r>
+        <w:t>(I) GET ou Content-Type incorreto no /login retorna erro, mas sem orientação sobre o formato correto; pode causar retrabalho.</w:t>
+      </w:r>
+    </w:p>
+    <w:p>
+      <w:pPr>
+        <w:numPr>
+          <w:ilvl w:val="0"/>
+          <w:numId w:val="21"/>
+        </w:numPr>
+      </w:pPr>
+      <w:r>
+        <w:t>(R) Entradas não normalizadas (sem trim) podem ser rejeitadas ou aceitas de forma inconsistente, afetando a UX e suporte.</w:t>
+      </w:r>
+    </w:p>
+    <w:p>
+      <w:pPr>
+        <w:numPr>
+          <w:ilvl w:val="0"/>
+          <w:numId w:val="21"/>
+        </w:numPr>
+      </w:pPr>
+      <w:r>
+        <w:t>(I) Erros de formato de e-mail ou senha não distinguem campos; usuário não sabe o que corrigir.</w:t>
+      </w:r>
+    </w:p>
+    <w:p>
+      <w:pPr>
+        <w:numPr>
+          <w:ilvl w:val="0"/>
+          <w:numId w:val="21"/>
+        </w:numPr>
+      </w:pPr>
+      <w:r>
+        <w:t>(R) Falta de log/auditoria para tentativas falhas dificulta detecção de brute force.</w:t>
+      </w:r>
+    </w:p>
+    <w:p>
+      <w:pPr>
+        <w:numPr>
+          <w:ilvl w:val="0"/>
+          <w:numId w:val="21"/>
+        </w:numPr>
+      </w:pPr>
+      <w:r>
+        <w:t>(I) Mensagens não deixam claro o motivo do bloqueio (usuário bloqueado vs. rate limit), gerando confusão.</w:t>
+      </w:r>
+    </w:p>
+    <w:p>
+      <w:pPr>
+        <w:numPr>
+          <w:ilvl w:val="0"/>
+          <w:numId w:val="21"/>
+        </w:numPr>
+      </w:pPr>
+      <w:r>
+        <w:t>(I) Não há indicação visual quando o usuário bloqueado tenta login; pode parecer falha de rede.</w:t>
+      </w:r>
+    </w:p>
+    <w:p>
+      <w:pPr>
+        <w:numPr>
+          <w:ilvl w:val="0"/>
+          <w:numId w:val="21"/>
+        </w:numPr>
+      </w:pPr>
+      <w:r>
+        <w:t>(R) Sem confirmação de logout/revogação, o usuário pode acreditar que ainda está logado e gerar inconsistências.</w:t>
+      </w:r>
+    </w:p>
+    <w:p>
+      <w:pPr>
+        <w:numPr>
+          <w:ilvl w:val="0"/>
+          <w:numId w:val="21"/>
+        </w:numPr>
+      </w:pPr>
+      <w:r>
+        <w:t>(I) Campos adicionais no payload são ignorados silenciosamente; usuário pode achar que dados foram salvos.</w:t>
+      </w:r>
+    </w:p>
+    <w:p>
+      <w:pPr>
+        <w:numPr>
+          <w:ilvl w:val="0"/>
+          <w:numId w:val="21"/>
+        </w:numPr>
+      </w:pPr>
+      <w:r>
+        <w:t>(R) Se payload vazio ou parcial não for tratado consistentemente, pode ocorrer crash ou resposta inesperada.</w:t>
+      </w:r>
+    </w:p>
+    <w:p>
+      <w:pPr>
+        <w:numPr>
+          <w:ilvl w:val="0"/>
+          <w:numId w:val="21"/>
+        </w:numPr>
+      </w:pPr>
+      <w:r>
+        <w:t>(I) Tempo limite de sessão não informado; usuário é desconectado sem aviso.</w:t>
+      </w:r>
+    </w:p>
+    <w:p>
+      <w:pPr>
+        <w:numPr>
+          <w:ilvl w:val="0"/>
+          <w:numId w:val="21"/>
+        </w:numPr>
+      </w:pPr>
+      <w:r>
+        <w:t>(R) Mensagens diferentes para e-mail inexistente vs. senha errada podem facilitar enumeração de contas.</w:t>
+      </w:r>
+    </w:p>
+    <w:p>
+      <w:pPr>
+        <w:numPr>
+          <w:ilvl w:val="0"/>
+          <w:numId w:val="21"/>
+        </w:numPr>
+      </w:pPr>
+      <w:r>
+        <w:t>(I) Falta de orientação sobre requisitos de senha (tamanho/máscaras) antes do erro; gera tentativa-e-erro.</w:t>
+      </w:r>
+    </w:p>
+    <w:p>
+      <w:pPr>
+        <w:numPr>
+          <w:ilvl w:val="0"/>
+          <w:numId w:val="21"/>
+        </w:numPr>
+      </w:pPr>
+      <w:r>
+        <w:t>(R) Sem bloqueio pós-3 tentativas (ou sem feedback disso), aumenta risco de força bruta.</w:t>
+      </w:r>
+    </w:p>
+    <w:p>
+      <w:pPr>
+        <w:numPr>
+          <w:ilvl w:val="0"/>
+          <w:numId w:val="21"/>
+        </w:numPr>
+      </w:pPr>
+      <w:r>
+        <w:t>(I) Se o campo senha aceitar tipos não-string, pode gerar erro interno e mensagem genérica.</w:t>
+      </w:r>
+    </w:p>
+    <w:p>
+      <w:pPr>
+        <w:numPr>
+          <w:ilvl w:val="0"/>
+          <w:numId w:val="21"/>
+        </w:numPr>
+      </w:pPr>
+      <w:r>
+        <w:t>(R) Respostas 405/415 sem detalhes podem induzir clientes a usar verbos/headers incorretos repetidamente.</w:t>
+      </w:r>
+    </w:p>
+    <w:p>
+      <w:pPr>
+        <w:numPr>
+          <w:ilvl w:val="0"/>
+          <w:numId w:val="21"/>
+        </w:numPr>
+      </w:pPr>
+      <w:r>
+        <w:t>(I) Não há aviso de que caracteres especiais são permitidos; usuários evitam senhas fortes.</w:t>
+      </w:r>
+    </w:p>
+    <w:p>
+      <w:pPr>
+        <w:numPr>
+          <w:ilvl w:val="0"/>
+          <w:numId w:val="21"/>
+        </w:numPr>
+      </w:pPr>
+      <w:r>
+        <w:t>(R) Tokens não revogados após logout permitem reutilização indevida da sessão.</w:t>
+      </w:r>
+    </w:p>
+    <w:p>
+      <w:pPr>
+        <w:numPr>
+          <w:ilvl w:val="0"/>
+          <w:numId w:val="21"/>
+        </w:numPr>
+      </w:pPr>
+      <w:r>
+        <w:lastRenderedPageBreak/>
+        <w:t>(I) Se a API não devolver error consistente no body, front não consegue exibir mensagem clara.</w:t>
+      </w:r>
+    </w:p>
+    <w:p>
+      <w:pPr>
+        <w:numPr>
+          <w:ilvl w:val="0"/>
+          <w:numId w:val="21"/>
+        </w:numPr>
+      </w:pPr>
+      <w:r>
+        <w:t>(R) Sem limite de tamanho em campos, há risco de DOS ou truncamento inesperado.</w:t>
+      </w:r>
+    </w:p>
+    <w:p>
+      <w:pPr>
+        <w:numPr>
+          <w:ilvl w:val="0"/>
+          <w:numId w:val="21"/>
+        </w:numPr>
+      </w:pPr>
+      <w:r>
+        <w:t>(I) Falta de mensagens localizadas ou padronizadas pode confundir usuários em ambientes multilíngues.</w:t>
+      </w:r>
     </w:p>
     <w:p>
       <w:pPr>
@@ -898,6 +1087,7 @@
         <w:t>(*) Podem ser (I)nformações ou (R)iscos.</w:t>
       </w:r>
     </w:p>
+    <w:p/>
     <w:p>
       <w:pPr>
         <w:rPr>
@@ -913,57 +1103,134 @@
           <w:bCs/>
         </w:rPr>
       </w:pPr>
-      <w:r>
+    </w:p>
+    <w:p>
+      <w:pPr>
         <w:rPr>
           <w:b/>
           <w:bCs/>
         </w:rPr>
-        <w:t>Defeitos:</w:t>
-      </w:r>
-    </w:p>
-    <w:p>
-      <w:pPr>
-        <w:pStyle w:val="NormalWeb"/>
-        <w:numPr>
-          <w:ilvl w:val="0"/>
-          <w:numId w:val="18"/>
-        </w:numPr>
-      </w:pPr>
-      <w:r>
-        <w:t xml:space="preserve"> O rótulo ou mensagem apresentada ao usuário não reflete com precisão a regra de negócio configurada.</w:t>
-      </w:r>
-    </w:p>
-    <w:p>
-      <w:pPr>
-        <w:pStyle w:val="NormalWeb"/>
-        <w:numPr>
-          <w:ilvl w:val="0"/>
-          <w:numId w:val="18"/>
-        </w:numPr>
-      </w:pPr>
-      <w:r>
-        <w:t xml:space="preserve"> Após uma ação importante, o sistema retornou o usuário ao estado anterior ou finalizou a sessão inesperadamente.</w:t>
-      </w:r>
-    </w:p>
-    <w:p>
-      <w:pPr>
-        <w:pStyle w:val="NormalWeb"/>
-        <w:numPr>
-          <w:ilvl w:val="0"/>
-          <w:numId w:val="18"/>
-        </w:numPr>
-      </w:pPr>
-      <w:r>
-        <w:t>O comportamento observado após a operação não corresponde ao resultado esperado ou informado pela regra de negócio.</w:t>
-      </w:r>
-    </w:p>
-    <w:p/>
-    <w:p>
-      <w:pPr>
+      </w:pPr>
+      <w:r>
         <w:rPr>
           <w:b/>
           <w:bCs/>
         </w:rPr>
+        <w:t>Defeitos:</w:t>
+      </w:r>
+    </w:p>
+    <w:p>
+      <w:pPr>
+        <w:pStyle w:val="NormalWeb"/>
+        <w:numPr>
+          <w:ilvl w:val="0"/>
+          <w:numId w:val="18"/>
+        </w:numPr>
+      </w:pPr>
+      <w:r>
+        <w:t>Mensagens de erro não cobrem todos os cenários (ex.: bloqueado, rate limit, sessão expirada) ou não refletem a regra de negócio de forma clara.</w:t>
+      </w:r>
+    </w:p>
+    <w:p>
+      <w:pPr>
+        <w:pStyle w:val="NormalWeb"/>
+        <w:numPr>
+          <w:ilvl w:val="0"/>
+          <w:numId w:val="18"/>
+        </w:numPr>
+      </w:pPr>
+      <w:r>
+        <w:t>Após tentativas críticas (ex.: várias falhas), o sistema pode voltar ao estado anterior ou encerrar sessão sem indicar o motivo (bloqueio, expiração, revogação).</w:t>
+      </w:r>
+    </w:p>
+    <w:p>
+      <w:pPr>
+        <w:pStyle w:val="NormalWeb"/>
+        <w:numPr>
+          <w:ilvl w:val="0"/>
+          <w:numId w:val="18"/>
+        </w:numPr>
+      </w:pPr>
+      <w:r>
+        <w:t>Respostas após operações (POST /login, logout) não correspondem sempre ao comportamento esperado: retorno genérico, ausência de orientação sobre o próximo passo ou inconsistência entre status e body.</w:t>
+      </w:r>
+    </w:p>
+    <w:p>
+      <w:pPr>
+        <w:pStyle w:val="NormalWeb"/>
+        <w:numPr>
+          <w:ilvl w:val="0"/>
+          <w:numId w:val="18"/>
+        </w:numPr>
+      </w:pPr>
+      <w:r>
+        <w:t>Melhorias a implementar:</w:t>
+      </w:r>
+    </w:p>
+    <w:p>
+      <w:pPr>
+        <w:pStyle w:val="NormalWeb"/>
+        <w:numPr>
+          <w:ilvl w:val="0"/>
+          <w:numId w:val="18"/>
+        </w:numPr>
+      </w:pPr>
+      <w:r>
+        <w:t>Padronizar mensagens para cada regra (credencial inválida, bloqueio, rate limit, sessão expirada/revogada, Content-Type inválido, método não permitido), mantendo o mesmo campo error no body.</w:t>
+      </w:r>
+    </w:p>
+    <w:p>
+      <w:pPr>
+        <w:pStyle w:val="NormalWeb"/>
+        <w:numPr>
+          <w:ilvl w:val="0"/>
+          <w:numId w:val="18"/>
+        </w:numPr>
+      </w:pPr>
+      <w:r>
+        <w:t>Garantir feedback imediato no cliente (loading, aviso de erro, instrução de correção) e diferenciar visualmente bloqueio vs. falha de credencial.</w:t>
+      </w:r>
+    </w:p>
+    <w:p>
+      <w:pPr>
+        <w:pStyle w:val="NormalWeb"/>
+        <w:numPr>
+          <w:ilvl w:val="0"/>
+          <w:numId w:val="18"/>
+        </w:numPr>
+      </w:pPr>
+      <w:r>
+        <w:t>Confirmar e informar estado de sessão: expiração por inatividade, logout bem-sucedido com token revogado, e retorno claro quando o token for rejeitado.</w:t>
+      </w:r>
+    </w:p>
+    <w:p>
+      <w:pPr>
+        <w:pStyle w:val="NormalWeb"/>
+        <w:numPr>
+          <w:ilvl w:val="0"/>
+          <w:numId w:val="18"/>
+        </w:numPr>
+      </w:pPr>
+      <w:r>
+        <w:t>Log/auditoria de tentativas (sucesso/falha) para suporte e segurança; proteger contra enumeração de usuários (mensagem uniforme para e-mail inexistente/senha errada).</w:t>
+      </w:r>
+    </w:p>
+    <w:p>
+      <w:pPr>
+        <w:pStyle w:val="NormalWeb"/>
+        <w:numPr>
+          <w:ilvl w:val="0"/>
+          <w:numId w:val="18"/>
+        </w:numPr>
+      </w:pPr>
+      <w:r>
+        <w:t>Validar e normalizar entradas (trim, tipo string, limites de tamanho) e retornar mensagens específicas do campo para reduzir tentativas repetidas.</w:t>
+      </w:r>
+    </w:p>
+    <w:p>
+      <w:pPr>
+        <w:pStyle w:val="NormalWeb"/>
+        <w:ind w:left="720"/>
       </w:pPr>
     </w:p>
     <w:p>
@@ -978,59 +1245,435 @@
           <w:b/>
           <w:bCs/>
         </w:rPr>
-        <w:t>Perguntas:</w:t>
-      </w:r>
-    </w:p>
-    <w:p>
-      <w:pPr>
-        <w:pStyle w:val="NormalWeb"/>
-        <w:numPr>
-          <w:ilvl w:val="0"/>
-          <w:numId w:val="17"/>
-        </w:numPr>
-      </w:pPr>
-      <w:r>
-        <w:t xml:space="preserve"> A ação realizada deve realmente permitir que origem e destino sejam os mesmos?</w:t>
-      </w:r>
-    </w:p>
-    <w:p>
-      <w:pPr>
-        <w:pStyle w:val="NormalWeb"/>
-        <w:numPr>
-          <w:ilvl w:val="0"/>
-          <w:numId w:val="17"/>
-        </w:numPr>
-      </w:pPr>
-      <w:r>
-        <w:t>O sistema deveria apresentar feedback mais claro após essa operação?</w:t>
-      </w:r>
-    </w:p>
-    <w:p>
-      <w:pPr>
-        <w:pStyle w:val="NormalWeb"/>
-        <w:numPr>
-          <w:ilvl w:val="0"/>
-          <w:numId w:val="17"/>
-        </w:numPr>
-      </w:pPr>
-      <w:r>
-        <w:t>Há alguma regra oculta ou não documentada que justifique o comportamento observado?</w:t>
-      </w:r>
-    </w:p>
-    <w:p/>
-    <w:p>
-      <w:pPr>
-        <w:pStyle w:val="Cabealho"/>
+        <w:t>Melhoria a ser implementada</w:t>
+      </w:r>
+      <w:r>
         <w:rPr>
           <w:b/>
           <w:bCs/>
         </w:rPr>
+        <w:t>:</w:t>
+      </w:r>
+    </w:p>
+    <w:p>
+      <w:pPr>
+        <w:rPr>
+          <w:b/>
+          <w:bCs/>
+        </w:rPr>
+      </w:pPr>
+    </w:p>
+    <w:p>
+      <w:r>
+        <w:t>Aqui vão 24 melhorias levantadas a partir dos testes automatizados de login:</w:t>
+      </w:r>
+    </w:p>
+    <w:p/>
+    <w:p>
+      <w:pPr>
+        <w:numPr>
+          <w:ilvl w:val="0"/>
+          <w:numId w:val="24"/>
+        </w:numPr>
+      </w:pPr>
+      <w:r>
+        <w:t>Unificar campo de erro (error) e mensagens conforme regra (credencial inválida, formato de e-mail, senha curta/longa, user bloqueado).</w:t>
+      </w:r>
+    </w:p>
+    <w:p>
+      <w:pPr>
+        <w:numPr>
+          <w:ilvl w:val="0"/>
+          <w:numId w:val="24"/>
+        </w:numPr>
+      </w:pPr>
+      <w:r>
+        <w:t>Trim consistente em e-mail e senha antes de validar e antes de responder.</w:t>
+      </w:r>
+    </w:p>
+    <w:p>
+      <w:pPr>
+        <w:numPr>
+          <w:ilvl w:val="0"/>
+          <w:numId w:val="24"/>
+        </w:numPr>
+      </w:pPr>
+      <w:r>
+        <w:t>Validar tipo string em e-mail e senha; rejeitar arrays/objetos/números.</w:t>
+      </w:r>
+    </w:p>
+    <w:p>
+      <w:pPr>
+        <w:numPr>
+          <w:ilvl w:val="0"/>
+          <w:numId w:val="24"/>
+        </w:numPr>
+      </w:pPr>
+      <w:r>
+        <w:lastRenderedPageBreak/>
+        <w:t>Regex mínima de e-mail (com @ e domínio) aplicada após trim.</w:t>
+      </w:r>
+    </w:p>
+    <w:p>
+      <w:pPr>
+        <w:numPr>
+          <w:ilvl w:val="0"/>
+          <w:numId w:val="24"/>
+        </w:numPr>
+      </w:pPr>
+      <w:r>
+        <w:t>Limites de tamanho da senha (mínimo e máximo) centralizados e documentados.</w:t>
+      </w:r>
+    </w:p>
+    <w:p>
+      <w:pPr>
+        <w:numPr>
+          <w:ilvl w:val="0"/>
+          <w:numId w:val="24"/>
+        </w:numPr>
+      </w:pPr>
+      <w:r>
+        <w:t>Campos obrigatórios: retornar mensagens específicas para e-mail ausente/nulo/vazio.</w:t>
+      </w:r>
+    </w:p>
+    <w:p>
+      <w:pPr>
+        <w:numPr>
+          <w:ilvl w:val="0"/>
+          <w:numId w:val="24"/>
+        </w:numPr>
+      </w:pPr>
+      <w:r>
+        <w:t>Campos obrigatórios: retornar mensagens específicas para senha ausente/nula/vazia.</w:t>
+      </w:r>
+    </w:p>
+    <w:p>
+      <w:pPr>
+        <w:numPr>
+          <w:ilvl w:val="0"/>
+          <w:numId w:val="24"/>
+        </w:numPr>
+      </w:pPr>
+      <w:r>
+        <w:t>Payload vazio: retornar erro único (“E-mail e senha são obrigatórios”).</w:t>
+      </w:r>
+    </w:p>
+    <w:p>
+      <w:pPr>
+        <w:numPr>
+          <w:ilvl w:val="0"/>
+          <w:numId w:val="24"/>
+        </w:numPr>
+      </w:pPr>
+      <w:r>
+        <w:t>Content-Type inválido: responder 415 com orientação de usar application/json.</w:t>
+      </w:r>
+    </w:p>
+    <w:p>
+      <w:pPr>
+        <w:numPr>
+          <w:ilvl w:val="0"/>
+          <w:numId w:val="24"/>
+        </w:numPr>
+      </w:pPr>
+      <w:r>
+        <w:t>Método não permitido (GET /login): responder 405 e não expor detalhes.</w:t>
+      </w:r>
+    </w:p>
+    <w:p>
+      <w:pPr>
+        <w:numPr>
+          <w:ilvl w:val="0"/>
+          <w:numId w:val="24"/>
+        </w:numPr>
+      </w:pPr>
+      <w:r>
+        <w:t>Token/credenciais corretas: garantir retorno 200 com token string.</w:t>
+      </w:r>
+    </w:p>
+    <w:p>
+      <w:pPr>
+        <w:numPr>
+          <w:ilvl w:val="0"/>
+          <w:numId w:val="24"/>
+        </w:numPr>
+      </w:pPr>
+      <w:r>
+        <w:t>Usuário bloqueado: responder 403 com mensagem clara e sem vazar detalhes.</w:t>
+      </w:r>
+    </w:p>
+    <w:p>
+      <w:pPr>
+        <w:numPr>
+          <w:ilvl w:val="0"/>
+          <w:numId w:val="24"/>
+        </w:numPr>
+      </w:pPr>
+      <w:r>
+        <w:t>Rate limit após N falhas: responder 429 e não vazar se o e-mail existe.</w:t>
+      </w:r>
+    </w:p>
+    <w:p>
+      <w:pPr>
+        <w:numPr>
+          <w:ilvl w:val="0"/>
+          <w:numId w:val="24"/>
+        </w:numPr>
+      </w:pPr>
+      <w:r>
+        <w:t>Maiúsculas/minúsculas no e-mail: normalizar e aceitar.</w:t>
+      </w:r>
+    </w:p>
+    <w:p>
+      <w:pPr>
+        <w:numPr>
+          <w:ilvl w:val="0"/>
+          <w:numId w:val="24"/>
+        </w:numPr>
+      </w:pPr>
+      <w:r>
+        <w:t>Senha com caracteres especiais: aceitar sem corromper encoding.</w:t>
+      </w:r>
+    </w:p>
+    <w:p>
+      <w:pPr>
+        <w:numPr>
+          <w:ilvl w:val="0"/>
+          <w:numId w:val="24"/>
+        </w:numPr>
+      </w:pPr>
+      <w:r>
+        <w:t>E-mails com espaços extras: aceitar após trim; sem duplicar usuários.</w:t>
+      </w:r>
+    </w:p>
+    <w:p>
+      <w:pPr>
+        <w:numPr>
+          <w:ilvl w:val="0"/>
+          <w:numId w:val="24"/>
+        </w:numPr>
+      </w:pPr>
+      <w:r>
+        <w:t>Senhas com espaços extras: trim aplicado para autenticar, conforme regra.</w:t>
+      </w:r>
+    </w:p>
+    <w:p>
+      <w:pPr>
+        <w:numPr>
+          <w:ilvl w:val="0"/>
+          <w:numId w:val="24"/>
+        </w:numPr>
+      </w:pPr>
+      <w:r>
+        <w:t>Ignorar campos extras no payload, mas manter autenticação consistente.</w:t>
+      </w:r>
+    </w:p>
+    <w:p>
+      <w:pPr>
+        <w:numPr>
+          <w:ilvl w:val="0"/>
+          <w:numId w:val="24"/>
+        </w:numPr>
+      </w:pPr>
+      <w:r>
+        <w:t>Tratamento de valores numéricos no e-mail: rejeitar com mensagem de formato inválido.</w:t>
+      </w:r>
+    </w:p>
+    <w:p>
+      <w:pPr>
+        <w:numPr>
+          <w:ilvl w:val="0"/>
+          <w:numId w:val="24"/>
+        </w:numPr>
+      </w:pPr>
+      <w:r>
+        <w:t>Tratamento de valores numéricos/array/obj na senha: rejeitar com mensagem de formato inválido.</w:t>
+      </w:r>
+    </w:p>
+    <w:p>
+      <w:pPr>
+        <w:numPr>
+          <w:ilvl w:val="0"/>
+          <w:numId w:val="24"/>
+        </w:numPr>
+      </w:pPr>
+      <w:r>
+        <w:t>Retorno consistente quando e-mail não cadastrado ou senha errada (mesma mensagem 401).</w:t>
+      </w:r>
+    </w:p>
+    <w:p>
+      <w:pPr>
+        <w:numPr>
+          <w:ilvl w:val="0"/>
+          <w:numId w:val="24"/>
+        </w:numPr>
+      </w:pPr>
+      <w:r>
+        <w:t>Bloqueio/timeout de sessão documentado e retornando status coerente (401/403) quando expira.</w:t>
+      </w:r>
+    </w:p>
+    <w:p>
+      <w:pPr>
+        <w:numPr>
+          <w:ilvl w:val="0"/>
+          <w:numId w:val="24"/>
+        </w:numPr>
+      </w:pPr>
+      <w:r>
+        <w:t>Revogação de token no logout e checagem em endpoints autenticados.</w:t>
+      </w:r>
+    </w:p>
+    <w:p>
+      <w:pPr>
+        <w:numPr>
+          <w:ilvl w:val="0"/>
+          <w:numId w:val="24"/>
+        </w:numPr>
+      </w:pPr>
+      <w:r>
+        <w:t>Log/auditoria de tentativas (sucesso/falha) para suporte e detecção de abuso (força bruta).</w:t>
+      </w:r>
+    </w:p>
+    <w:p/>
+    <w:p>
+      <w:pPr>
+        <w:rPr>
+          <w:b/>
+          <w:bCs/>
+        </w:rPr>
+      </w:pPr>
+    </w:p>
+    <w:p>
+      <w:pPr>
+        <w:pStyle w:val="NormalWeb"/>
+        <w:ind w:left="720"/>
+      </w:pPr>
+    </w:p>
+    <w:p/>
+    <w:p>
+      <w:pPr>
+        <w:rPr>
+          <w:b/>
+          <w:bCs/>
+        </w:rPr>
+      </w:pPr>
+    </w:p>
+    <w:p>
+      <w:pPr>
+        <w:rPr>
+          <w:b/>
+          <w:bCs/>
+        </w:rPr>
+      </w:pPr>
+      <w:r>
+        <w:rPr>
+          <w:b/>
+          <w:bCs/>
+        </w:rPr>
+        <w:t>Perguntas:</w:t>
+      </w:r>
+    </w:p>
+    <w:p>
+      <w:pPr>
+        <w:pStyle w:val="NormalWeb"/>
+        <w:numPr>
+          <w:ilvl w:val="0"/>
+          <w:numId w:val="17"/>
+        </w:numPr>
+      </w:pPr>
+      <w:r>
+        <w:t>As mensagens 401/403 devem ser distintas ou sempre genéricas para evitar enumeração de usuários?</w:t>
+      </w:r>
+    </w:p>
+    <w:p>
+      <w:pPr>
+        <w:pStyle w:val="NormalWeb"/>
+        <w:numPr>
+          <w:ilvl w:val="0"/>
+          <w:numId w:val="17"/>
+        </w:numPr>
+      </w:pPr>
+      <w:r>
+        <w:t>O bloqueio por múltiplas falhas deve informar tempo restante ou só dizer “tente mais tarde”?</w:t>
+      </w:r>
+    </w:p>
+    <w:p>
+      <w:pPr>
+        <w:pStyle w:val="NormalWeb"/>
+        <w:numPr>
+          <w:ilvl w:val="0"/>
+          <w:numId w:val="17"/>
+        </w:numPr>
+      </w:pPr>
+      <w:r>
+        <w:lastRenderedPageBreak/>
+        <w:t>Tokens expirados/revogados devem forçar logout automático no cliente ou apenas retornar 401/403 até o usuário renovar?</w:t>
+      </w:r>
+    </w:p>
+    <w:p>
+      <w:pPr>
+        <w:pStyle w:val="NormalWeb"/>
+        <w:numPr>
+          <w:ilvl w:val="0"/>
+          <w:numId w:val="17"/>
+        </w:numPr>
+      </w:pPr>
+      <w:r>
+        <w:t>É aceitável trim na senha (removendo espaços) ou a regra é preservar exatamente o input?</w:t>
+      </w:r>
+    </w:p>
+    <w:p>
+      <w:pPr>
+        <w:pStyle w:val="NormalWeb"/>
+        <w:numPr>
+          <w:ilvl w:val="0"/>
+          <w:numId w:val="17"/>
+        </w:numPr>
+      </w:pPr>
+      <w:r>
+        <w:t>Precisamos exigir MFA/2FA neste fluxo ou manter apenas usuário/senha?</w:t>
+      </w:r>
+    </w:p>
+    <w:p>
+      <w:pPr>
+        <w:pStyle w:val="NormalWeb"/>
+      </w:pPr>
+    </w:p>
+    <w:p/>
+    <w:p>
+      <w:pPr>
+        <w:pStyle w:val="Cabealho"/>
+        <w:rPr>
+          <w:b/>
+          <w:bCs/>
+        </w:rPr>
+      </w:pPr>
+    </w:p>
+    <w:p>
+      <w:pPr>
+        <w:pStyle w:val="Cabealho"/>
+        <w:rPr>
+          <w:b/>
+          <w:bCs/>
+        </w:rPr>
+      </w:pPr>
+    </w:p>
+    <w:p>
+      <w:pPr>
+        <w:pStyle w:val="Cabealho"/>
+        <w:rPr>
+          <w:b/>
+          <w:bCs/>
+        </w:rPr>
       </w:pPr>
     </w:p>
     <w:sectPr>
-      <w:headerReference w:type="default" r:id="rId8"/>
-      <w:footerReference w:type="default" r:id="rId9"/>
-      <w:headerReference w:type="first" r:id="rId10"/>
+      <w:headerReference w:type="even" r:id="rId8"/>
+      <w:headerReference w:type="default" r:id="rId9"/>
+      <w:footerReference w:type="even" r:id="rId10"/>
+      <w:footerReference w:type="default" r:id="rId11"/>
+      <w:headerReference w:type="first" r:id="rId12"/>
+      <w:footerReference w:type="first" r:id="rId13"/>
       <w:pgSz w:w="11906" w:h="16838"/>
       <w:pgMar w:top="1700" w:right="1133" w:bottom="1133" w:left="1700" w:header="0" w:footer="720" w:gutter="0"/>
       <w:pgNumType w:start="0"/>
@@ -1066,6 +1709,16 @@
 </file>
 
 <file path=word/footer1.xml><?xml version="1.0" encoding="utf-8"?>
+<w:ftr xmlns:wpc="http://schemas.microsoft.com/office/word/2010/wordprocessingCanvas" xmlns:cx="http://schemas.microsoft.com/office/drawing/2014/chartex" xmlns:cx1="http://schemas.microsoft.com/office/drawing/2015/9/8/chartex" xmlns:cx2="http://schemas.microsoft.com/office/drawing/2015/10/21/chartex" xmlns:cx3="http://schemas.microsoft.com/office/drawing/2016/5/9/chartex" xmlns:cx4="http://schemas.microsoft.com/office/drawing/2016/5/10/chartex" xmlns:cx5="http://schemas.microsoft.com/office/drawing/2016/5/11/chartex" xmlns:cx6="http://schemas.microsoft.com/office/drawing/2016/5/12/chartex" xmlns:cx7="http://schemas.microsoft.com/office/drawing/2016/5/13/chartex" xmlns:cx8="http://schemas.microsoft.com/office/drawing/2016/5/14/chartex" xmlns:mc="http://schemas.openxmlformats.org/markup-compatibility/2006" xmlns:aink="http://schemas.microsoft.com/office/drawing/2016/ink" xmlns:am3d="http://schemas.microsoft.com/office/drawing/2017/model3d" xmlns:o="urn:schemas-microsoft-com:office:office" xmlns:oel="http://schemas.microsoft.com/office/2019/extlst" xmlns:r="http://schemas.openxmlformats.org/officeDocument/2006/relationships" xmlns:m="http://schemas.openxmlformats.org/officeDocument/2006/math" xmlns:v="urn:schemas-microsoft-com:vml" xmlns:wp14="http://schemas.microsoft.com/office/word/2010/wordprocessingDrawing" xmlns:wp="http://schemas.openxmlformats.org/drawingml/2006/wordprocessingDrawing" xmlns:w10="urn:schemas-microsoft-com:office:word" xmlns:w="http://schemas.openxmlformats.org/wordprocessingml/2006/main" xmlns:w14="http://schemas.microsoft.com/office/word/2010/wordml" xmlns:w15="http://schemas.microsoft.com/office/word/2012/wordml" xmlns:w16cex="http://schemas.microsoft.com/office/word/2018/wordml/cex" xmlns:w16cid="http://schemas.microsoft.com/office/word/2016/wordml/cid" xmlns:w16="http://schemas.microsoft.com/office/word/2018/wordml" xmlns:w16sdtdh="http://schemas.microsoft.com/office/word/2020/wordml/sdtdatahash" xmlns:w16se="http://schemas.microsoft.com/office/word/2015/wordml/symex" xmlns:wpg="http://schemas.microsoft.com/office/word/2010/wordprocessingGroup" xmlns:wpi="http://schemas.microsoft.com/office/word/2010/wordprocessingInk" xmlns:wne="http://schemas.microsoft.com/office/word/2006/wordml" xmlns:wps="http://schemas.microsoft.com/office/word/2010/wordprocessingShape" mc:Ignorable="w14 w15 w16se w16cid w16 w16cex w16sdtdh wp14">
+  <w:p>
+    <w:pPr>
+      <w:pStyle w:val="Rodap"/>
+    </w:pPr>
+  </w:p>
+</w:ftr>
+</file>
+
+<file path=word/footer2.xml><?xml version="1.0" encoding="utf-8"?>
 <w:ftr xmlns:wpc="http://schemas.microsoft.com/office/word/2010/wordprocessingCanvas" xmlns:cx="http://schemas.microsoft.com/office/drawing/2014/chartex" xmlns:cx1="http://schemas.microsoft.com/office/drawing/2015/9/8/chartex" xmlns:cx2="http://schemas.microsoft.com/office/drawing/2015/10/21/chartex" xmlns:cx3="http://schemas.microsoft.com/office/drawing/2016/5/9/chartex" xmlns:cx4="http://schemas.microsoft.com/office/drawing/2016/5/10/chartex" xmlns:cx5="http://schemas.microsoft.com/office/drawing/2016/5/11/chartex" xmlns:cx6="http://schemas.microsoft.com/office/drawing/2016/5/12/chartex" xmlns:cx7="http://schemas.microsoft.com/office/drawing/2016/5/13/chartex" xmlns:cx8="http://schemas.microsoft.com/office/drawing/2016/5/14/chartex" xmlns:mc="http://schemas.openxmlformats.org/markup-compatibility/2006" xmlns:aink="http://schemas.microsoft.com/office/drawing/2016/ink" xmlns:am3d="http://schemas.microsoft.com/office/drawing/2017/model3d" xmlns:o="urn:schemas-microsoft-com:office:office" xmlns:oel="http://schemas.microsoft.com/office/2019/extlst" xmlns:r="http://schemas.openxmlformats.org/officeDocument/2006/relationships" xmlns:m="http://schemas.openxmlformats.org/officeDocument/2006/math" xmlns:v="urn:schemas-microsoft-com:vml" xmlns:wp14="http://schemas.microsoft.com/office/word/2010/wordprocessingDrawing" xmlns:wp="http://schemas.openxmlformats.org/drawingml/2006/wordprocessingDrawing" xmlns:w10="urn:schemas-microsoft-com:office:word" xmlns:w="http://schemas.openxmlformats.org/wordprocessingml/2006/main" xmlns:w14="http://schemas.microsoft.com/office/word/2010/wordml" xmlns:w15="http://schemas.microsoft.com/office/word/2012/wordml" xmlns:w16cex="http://schemas.microsoft.com/office/word/2018/wordml/cex" xmlns:w16cid="http://schemas.microsoft.com/office/word/2016/wordml/cid" xmlns:w16="http://schemas.microsoft.com/office/word/2018/wordml" xmlns:w16sdtdh="http://schemas.microsoft.com/office/word/2020/wordml/sdtdatahash" xmlns:w16se="http://schemas.microsoft.com/office/word/2015/wordml/symex" xmlns:wpg="http://schemas.microsoft.com/office/word/2010/wordprocessingGroup" xmlns:wpi="http://schemas.microsoft.com/office/word/2010/wordprocessingInk" xmlns:wne="http://schemas.microsoft.com/office/word/2006/wordml" xmlns:wps="http://schemas.microsoft.com/office/word/2010/wordprocessingShape" mc:Ignorable="w14 w15 w16se w16cid w16 w16cex w16sdtdh wp14">
   <w:p>
     <w:pPr>
@@ -1134,7 +1787,7 @@
         <w:sz w:val="18"/>
         <w:szCs w:val="18"/>
       </w:rPr>
-      <w:t>08</w:t>
+      <w:t>0</w:t>
     </w:r>
     <w:r>
       <w:rPr>
@@ -1142,6 +1795,14 @@
         <w:sz w:val="18"/>
         <w:szCs w:val="18"/>
       </w:rPr>
+      <w:t>5</w:t>
+    </w:r>
+    <w:r>
+      <w:rPr>
+        <w:color w:val="000000"/>
+        <w:sz w:val="18"/>
+        <w:szCs w:val="18"/>
+      </w:rPr>
       <w:t>/</w:t>
     </w:r>
     <w:r>
@@ -1150,7 +1811,15 @@
         <w:sz w:val="18"/>
         <w:szCs w:val="18"/>
       </w:rPr>
-      <w:t>11</w:t>
+      <w:t>1</w:t>
+    </w:r>
+    <w:r>
+      <w:rPr>
+        <w:color w:val="000000"/>
+        <w:sz w:val="18"/>
+        <w:szCs w:val="18"/>
+      </w:rPr>
+      <w:t>2</w:t>
     </w:r>
     <w:r>
       <w:rPr>
@@ -1195,6 +1864,16 @@
 </w:ftr>
 </file>
 
+<file path=word/footer3.xml><?xml version="1.0" encoding="utf-8"?>
+<w:ftr xmlns:wpc="http://schemas.microsoft.com/office/word/2010/wordprocessingCanvas" xmlns:cx="http://schemas.microsoft.com/office/drawing/2014/chartex" xmlns:cx1="http://schemas.microsoft.com/office/drawing/2015/9/8/chartex" xmlns:cx2="http://schemas.microsoft.com/office/drawing/2015/10/21/chartex" xmlns:cx3="http://schemas.microsoft.com/office/drawing/2016/5/9/chartex" xmlns:cx4="http://schemas.microsoft.com/office/drawing/2016/5/10/chartex" xmlns:cx5="http://schemas.microsoft.com/office/drawing/2016/5/11/chartex" xmlns:cx6="http://schemas.microsoft.com/office/drawing/2016/5/12/chartex" xmlns:cx7="http://schemas.microsoft.com/office/drawing/2016/5/13/chartex" xmlns:cx8="http://schemas.microsoft.com/office/drawing/2016/5/14/chartex" xmlns:mc="http://schemas.openxmlformats.org/markup-compatibility/2006" xmlns:aink="http://schemas.microsoft.com/office/drawing/2016/ink" xmlns:am3d="http://schemas.microsoft.com/office/drawing/2017/model3d" xmlns:o="urn:schemas-microsoft-com:office:office" xmlns:oel="http://schemas.microsoft.com/office/2019/extlst" xmlns:r="http://schemas.openxmlformats.org/officeDocument/2006/relationships" xmlns:m="http://schemas.openxmlformats.org/officeDocument/2006/math" xmlns:v="urn:schemas-microsoft-com:vml" xmlns:wp14="http://schemas.microsoft.com/office/word/2010/wordprocessingDrawing" xmlns:wp="http://schemas.openxmlformats.org/drawingml/2006/wordprocessingDrawing" xmlns:w10="urn:schemas-microsoft-com:office:word" xmlns:w="http://schemas.openxmlformats.org/wordprocessingml/2006/main" xmlns:w14="http://schemas.microsoft.com/office/word/2010/wordml" xmlns:w15="http://schemas.microsoft.com/office/word/2012/wordml" xmlns:w16cex="http://schemas.microsoft.com/office/word/2018/wordml/cex" xmlns:w16cid="http://schemas.microsoft.com/office/word/2016/wordml/cid" xmlns:w16="http://schemas.microsoft.com/office/word/2018/wordml" xmlns:w16sdtdh="http://schemas.microsoft.com/office/word/2020/wordml/sdtdatahash" xmlns:w16se="http://schemas.microsoft.com/office/word/2015/wordml/symex" xmlns:wpg="http://schemas.microsoft.com/office/word/2010/wordprocessingGroup" xmlns:wpi="http://schemas.microsoft.com/office/word/2010/wordprocessingInk" xmlns:wne="http://schemas.microsoft.com/office/word/2006/wordml" xmlns:wps="http://schemas.microsoft.com/office/word/2010/wordprocessingShape" mc:Ignorable="w14 w15 w16se w16cid w16 w16cex w16sdtdh wp14">
+  <w:p>
+    <w:pPr>
+      <w:pStyle w:val="Rodap"/>
+    </w:pPr>
+  </w:p>
+</w:ftr>
+</file>
+
 <file path=word/footnotes.xml><?xml version="1.0" encoding="utf-8"?>
 <w:footnotes xmlns:wpc="http://schemas.microsoft.com/office/word/2010/wordprocessingCanvas" xmlns:cx="http://schemas.microsoft.com/office/drawing/2014/chartex" xmlns:cx1="http://schemas.microsoft.com/office/drawing/2015/9/8/chartex" xmlns:cx2="http://schemas.microsoft.com/office/drawing/2015/10/21/chartex" xmlns:cx3="http://schemas.microsoft.com/office/drawing/2016/5/9/chartex" xmlns:cx4="http://schemas.microsoft.com/office/drawing/2016/5/10/chartex" xmlns:cx5="http://schemas.microsoft.com/office/drawing/2016/5/11/chartex" xmlns:cx6="http://schemas.microsoft.com/office/drawing/2016/5/12/chartex" xmlns:cx7="http://schemas.microsoft.com/office/drawing/2016/5/13/chartex" xmlns:cx8="http://schemas.microsoft.com/office/drawing/2016/5/14/chartex" xmlns:mc="http://schemas.openxmlformats.org/markup-compatibility/2006" xmlns:aink="http://schemas.microsoft.com/office/drawing/2016/ink" xmlns:am3d="http://schemas.microsoft.com/office/drawing/2017/model3d" xmlns:o="urn:schemas-microsoft-com:office:office" xmlns:oel="http://schemas.microsoft.com/office/2019/extlst" xmlns:r="http://schemas.openxmlformats.org/officeDocument/2006/relationships" xmlns:m="http://schemas.openxmlformats.org/officeDocument/2006/math" xmlns:v="urn:schemas-microsoft-com:vml" xmlns:wp14="http://schemas.microsoft.com/office/word/2010/wordprocessingDrawing" xmlns:wp="http://schemas.openxmlformats.org/drawingml/2006/wordprocessingDrawing" xmlns:w10="urn:schemas-microsoft-com:office:word" xmlns:w="http://schemas.openxmlformats.org/wordprocessingml/2006/main" xmlns:w14="http://schemas.microsoft.com/office/word/2010/wordml" xmlns:w15="http://schemas.microsoft.com/office/word/2012/wordml" xmlns:w16cex="http://schemas.microsoft.com/office/word/2018/wordml/cex" xmlns:w16cid="http://schemas.microsoft.com/office/word/2016/wordml/cid" xmlns:w16="http://schemas.microsoft.com/office/word/2018/wordml" xmlns:w16sdtdh="http://schemas.microsoft.com/office/word/2020/wordml/sdtdatahash" xmlns:w16se="http://schemas.microsoft.com/office/word/2015/wordml/symex" xmlns:wpg="http://schemas.microsoft.com/office/word/2010/wordprocessingGroup" xmlns:wpi="http://schemas.microsoft.com/office/word/2010/wordprocessingInk" xmlns:wne="http://schemas.microsoft.com/office/word/2006/wordml" xmlns:wps="http://schemas.microsoft.com/office/word/2010/wordprocessingShape" mc:Ignorable="w14 w15 w16se w16cid w16 w16cex w16sdtdh wp14">
   <w:footnote w:type="separator" w:id="-1">
@@ -1221,6 +1900,16 @@
 </file>
 
 <file path=word/header1.xml><?xml version="1.0" encoding="utf-8"?>
+<w:hdr xmlns:wpc="http://schemas.microsoft.com/office/word/2010/wordprocessingCanvas" xmlns:cx="http://schemas.microsoft.com/office/drawing/2014/chartex" xmlns:cx1="http://schemas.microsoft.com/office/drawing/2015/9/8/chartex" xmlns:cx2="http://schemas.microsoft.com/office/drawing/2015/10/21/chartex" xmlns:cx3="http://schemas.microsoft.com/office/drawing/2016/5/9/chartex" xmlns:cx4="http://schemas.microsoft.com/office/drawing/2016/5/10/chartex" xmlns:cx5="http://schemas.microsoft.com/office/drawing/2016/5/11/chartex" xmlns:cx6="http://schemas.microsoft.com/office/drawing/2016/5/12/chartex" xmlns:cx7="http://schemas.microsoft.com/office/drawing/2016/5/13/chartex" xmlns:cx8="http://schemas.microsoft.com/office/drawing/2016/5/14/chartex" xmlns:mc="http://schemas.openxmlformats.org/markup-compatibility/2006" xmlns:aink="http://schemas.microsoft.com/office/drawing/2016/ink" xmlns:am3d="http://schemas.microsoft.com/office/drawing/2017/model3d" xmlns:o="urn:schemas-microsoft-com:office:office" xmlns:oel="http://schemas.microsoft.com/office/2019/extlst" xmlns:r="http://schemas.openxmlformats.org/officeDocument/2006/relationships" xmlns:m="http://schemas.openxmlformats.org/officeDocument/2006/math" xmlns:v="urn:schemas-microsoft-com:vml" xmlns:wp14="http://schemas.microsoft.com/office/word/2010/wordprocessingDrawing" xmlns:wp="http://schemas.openxmlformats.org/drawingml/2006/wordprocessingDrawing" xmlns:w10="urn:schemas-microsoft-com:office:word" xmlns:w="http://schemas.openxmlformats.org/wordprocessingml/2006/main" xmlns:w14="http://schemas.microsoft.com/office/word/2010/wordml" xmlns:w15="http://schemas.microsoft.com/office/word/2012/wordml" xmlns:w16cex="http://schemas.microsoft.com/office/word/2018/wordml/cex" xmlns:w16cid="http://schemas.microsoft.com/office/word/2016/wordml/cid" xmlns:w16="http://schemas.microsoft.com/office/word/2018/wordml" xmlns:w16sdtdh="http://schemas.microsoft.com/office/word/2020/wordml/sdtdatahash" xmlns:w16se="http://schemas.microsoft.com/office/word/2015/wordml/symex" xmlns:wpg="http://schemas.microsoft.com/office/word/2010/wordprocessingGroup" xmlns:wpi="http://schemas.microsoft.com/office/word/2010/wordprocessingInk" xmlns:wne="http://schemas.microsoft.com/office/word/2006/wordml" xmlns:wps="http://schemas.microsoft.com/office/word/2010/wordprocessingShape" mc:Ignorable="w14 w15 w16se w16cid w16 w16cex w16sdtdh wp14">
+  <w:p>
+    <w:pPr>
+      <w:pStyle w:val="Cabealho"/>
+    </w:pPr>
+  </w:p>
+</w:hdr>
+</file>
+
+<file path=word/header2.xml><?xml version="1.0" encoding="utf-8"?>
 <w:hdr xmlns:wpc="http://schemas.microsoft.com/office/word/2010/wordprocessingCanvas" xmlns:cx="http://schemas.microsoft.com/office/drawing/2014/chartex" xmlns:cx1="http://schemas.microsoft.com/office/drawing/2015/9/8/chartex" xmlns:cx2="http://schemas.microsoft.com/office/drawing/2015/10/21/chartex" xmlns:cx3="http://schemas.microsoft.com/office/drawing/2016/5/9/chartex" xmlns:cx4="http://schemas.microsoft.com/office/drawing/2016/5/10/chartex" xmlns:cx5="http://schemas.microsoft.com/office/drawing/2016/5/11/chartex" xmlns:cx6="http://schemas.microsoft.com/office/drawing/2016/5/12/chartex" xmlns:cx7="http://schemas.microsoft.com/office/drawing/2016/5/13/chartex" xmlns:cx8="http://schemas.microsoft.com/office/drawing/2016/5/14/chartex" xmlns:mc="http://schemas.openxmlformats.org/markup-compatibility/2006" xmlns:aink="http://schemas.microsoft.com/office/drawing/2016/ink" xmlns:am3d="http://schemas.microsoft.com/office/drawing/2017/model3d" xmlns:o="urn:schemas-microsoft-com:office:office" xmlns:oel="http://schemas.microsoft.com/office/2019/extlst" xmlns:r="http://schemas.openxmlformats.org/officeDocument/2006/relationships" xmlns:m="http://schemas.openxmlformats.org/officeDocument/2006/math" xmlns:v="urn:schemas-microsoft-com:vml" xmlns:wp14="http://schemas.microsoft.com/office/word/2010/wordprocessingDrawing" xmlns:wp="http://schemas.openxmlformats.org/drawingml/2006/wordprocessingDrawing" xmlns:w10="urn:schemas-microsoft-com:office:word" xmlns:w="http://schemas.openxmlformats.org/wordprocessingml/2006/main" xmlns:w14="http://schemas.microsoft.com/office/word/2010/wordml" xmlns:w15="http://schemas.microsoft.com/office/word/2012/wordml" xmlns:w16cex="http://schemas.microsoft.com/office/word/2018/wordml/cex" xmlns:w16cid="http://schemas.microsoft.com/office/word/2016/wordml/cid" xmlns:w16="http://schemas.microsoft.com/office/word/2018/wordml" xmlns:w16sdtdh="http://schemas.microsoft.com/office/word/2020/wordml/sdtdatahash" xmlns:w16se="http://schemas.microsoft.com/office/word/2015/wordml/symex" xmlns:wpg="http://schemas.microsoft.com/office/word/2010/wordprocessingGroup" xmlns:wpi="http://schemas.microsoft.com/office/word/2010/wordprocessingInk" xmlns:wne="http://schemas.microsoft.com/office/word/2006/wordml" xmlns:wps="http://schemas.microsoft.com/office/word/2010/wordprocessingShape" mc:Ignorable="w14 w15 w16se w16cid w16 w16cex w16sdtdh wp14">
   <w:p>
     <w:pPr>
@@ -1708,7 +2397,7 @@
 </w:hdr>
 </file>
 
-<file path=word/header2.xml><?xml version="1.0" encoding="utf-8"?>
+<file path=word/header3.xml><?xml version="1.0" encoding="utf-8"?>
 <w:hdr xmlns:wpc="http://schemas.microsoft.com/office/word/2010/wordprocessingCanvas" xmlns:cx="http://schemas.microsoft.com/office/drawing/2014/chartex" xmlns:cx1="http://schemas.microsoft.com/office/drawing/2015/9/8/chartex" xmlns:cx2="http://schemas.microsoft.com/office/drawing/2015/10/21/chartex" xmlns:cx3="http://schemas.microsoft.com/office/drawing/2016/5/9/chartex" xmlns:cx4="http://schemas.microsoft.com/office/drawing/2016/5/10/chartex" xmlns:cx5="http://schemas.microsoft.com/office/drawing/2016/5/11/chartex" xmlns:cx6="http://schemas.microsoft.com/office/drawing/2016/5/12/chartex" xmlns:cx7="http://schemas.microsoft.com/office/drawing/2016/5/13/chartex" xmlns:cx8="http://schemas.microsoft.com/office/drawing/2016/5/14/chartex" xmlns:mc="http://schemas.openxmlformats.org/markup-compatibility/2006" xmlns:aink="http://schemas.microsoft.com/office/drawing/2016/ink" xmlns:am3d="http://schemas.microsoft.com/office/drawing/2017/model3d" xmlns:o="urn:schemas-microsoft-com:office:office" xmlns:oel="http://schemas.microsoft.com/office/2019/extlst" xmlns:r="http://schemas.openxmlformats.org/officeDocument/2006/relationships" xmlns:m="http://schemas.openxmlformats.org/officeDocument/2006/math" xmlns:v="urn:schemas-microsoft-com:vml" xmlns:wp14="http://schemas.microsoft.com/office/word/2010/wordprocessingDrawing" xmlns:wp="http://schemas.openxmlformats.org/drawingml/2006/wordprocessingDrawing" xmlns:w10="urn:schemas-microsoft-com:office:word" xmlns:w="http://schemas.openxmlformats.org/wordprocessingml/2006/main" xmlns:w14="http://schemas.microsoft.com/office/word/2010/wordml" xmlns:w15="http://schemas.microsoft.com/office/word/2012/wordml" xmlns:w16cex="http://schemas.microsoft.com/office/word/2018/wordml/cex" xmlns:w16cid="http://schemas.microsoft.com/office/word/2016/wordml/cid" xmlns:w16="http://schemas.microsoft.com/office/word/2018/wordml" xmlns:w16sdtdh="http://schemas.microsoft.com/office/word/2020/wordml/sdtdatahash" xmlns:w16se="http://schemas.microsoft.com/office/word/2015/wordml/symex" xmlns:wpg="http://schemas.microsoft.com/office/word/2010/wordprocessingGroup" xmlns:wpi="http://schemas.microsoft.com/office/word/2010/wordprocessingInk" xmlns:wne="http://schemas.microsoft.com/office/word/2006/wordml" xmlns:wps="http://schemas.microsoft.com/office/word/2010/wordprocessingShape" mc:Ignorable="w14 w15 w16se w16cid w16 w16cex w16sdtdh wp14">
   <w:p>
     <w:pPr>
@@ -1864,6 +2553,155 @@
     </w:lvl>
   </w:abstractNum>
   <w:abstractNum w:abstractNumId="1" w15:restartNumberingAfterBreak="0">
+    <w:nsid w:val="06D0116B"/>
+    <w:multiLevelType w:val="multilevel"/>
+    <w:tmpl w:val="ED8CDD46"/>
+    <w:lvl w:ilvl="0">
+      <w:start w:val="1"/>
+      <w:numFmt w:val="bullet"/>
+      <w:lvlText w:val=""/>
+      <w:lvlJc w:val="left"/>
+      <w:pPr>
+        <w:tabs>
+          <w:tab w:val="num" w:pos="720"/>
+        </w:tabs>
+        <w:ind w:left="720" w:hanging="360"/>
+      </w:pPr>
+      <w:rPr>
+        <w:rFonts w:ascii="Symbol" w:hAnsi="Symbol" w:hint="default"/>
+        <w:sz w:val="20"/>
+      </w:rPr>
+    </w:lvl>
+    <w:lvl w:ilvl="1" w:tentative="1">
+      <w:start w:val="1"/>
+      <w:numFmt w:val="bullet"/>
+      <w:lvlText w:val=""/>
+      <w:lvlJc w:val="left"/>
+      <w:pPr>
+        <w:tabs>
+          <w:tab w:val="num" w:pos="1440"/>
+        </w:tabs>
+        <w:ind w:left="1440" w:hanging="360"/>
+      </w:pPr>
+      <w:rPr>
+        <w:rFonts w:ascii="Symbol" w:hAnsi="Symbol" w:hint="default"/>
+        <w:sz w:val="20"/>
+      </w:rPr>
+    </w:lvl>
+    <w:lvl w:ilvl="2" w:tentative="1">
+      <w:start w:val="1"/>
+      <w:numFmt w:val="bullet"/>
+      <w:lvlText w:val=""/>
+      <w:lvlJc w:val="left"/>
+      <w:pPr>
+        <w:tabs>
+          <w:tab w:val="num" w:pos="2160"/>
+        </w:tabs>
+        <w:ind w:left="2160" w:hanging="360"/>
+      </w:pPr>
+      <w:rPr>
+        <w:rFonts w:ascii="Symbol" w:hAnsi="Symbol" w:hint="default"/>
+        <w:sz w:val="20"/>
+      </w:rPr>
+    </w:lvl>
+    <w:lvl w:ilvl="3" w:tentative="1">
+      <w:start w:val="1"/>
+      <w:numFmt w:val="bullet"/>
+      <w:lvlText w:val=""/>
+      <w:lvlJc w:val="left"/>
+      <w:pPr>
+        <w:tabs>
+          <w:tab w:val="num" w:pos="2880"/>
+        </w:tabs>
+        <w:ind w:left="2880" w:hanging="360"/>
+      </w:pPr>
+      <w:rPr>
+        <w:rFonts w:ascii="Symbol" w:hAnsi="Symbol" w:hint="default"/>
+        <w:sz w:val="20"/>
+      </w:rPr>
+    </w:lvl>
+    <w:lvl w:ilvl="4" w:tentative="1">
+      <w:start w:val="1"/>
+      <w:numFmt w:val="bullet"/>
+      <w:lvlText w:val=""/>
+      <w:lvlJc w:val="left"/>
+      <w:pPr>
+        <w:tabs>
+          <w:tab w:val="num" w:pos="3600"/>
+        </w:tabs>
+        <w:ind w:left="3600" w:hanging="360"/>
+      </w:pPr>
+      <w:rPr>
+        <w:rFonts w:ascii="Symbol" w:hAnsi="Symbol" w:hint="default"/>
+        <w:sz w:val="20"/>
+      </w:rPr>
+    </w:lvl>
+    <w:lvl w:ilvl="5" w:tentative="1">
+      <w:start w:val="1"/>
+      <w:numFmt w:val="bullet"/>
+      <w:lvlText w:val=""/>
+      <w:lvlJc w:val="left"/>
+      <w:pPr>
+        <w:tabs>
+          <w:tab w:val="num" w:pos="4320"/>
+        </w:tabs>
+        <w:ind w:left="4320" w:hanging="360"/>
+      </w:pPr>
+      <w:rPr>
+        <w:rFonts w:ascii="Symbol" w:hAnsi="Symbol" w:hint="default"/>
+        <w:sz w:val="20"/>
+      </w:rPr>
+    </w:lvl>
+    <w:lvl w:ilvl="6" w:tentative="1">
+      <w:start w:val="1"/>
+      <w:numFmt w:val="bullet"/>
+      <w:lvlText w:val=""/>
+      <w:lvlJc w:val="left"/>
+      <w:pPr>
+        <w:tabs>
+          <w:tab w:val="num" w:pos="5040"/>
+        </w:tabs>
+        <w:ind w:left="5040" w:hanging="360"/>
+      </w:pPr>
+      <w:rPr>
+        <w:rFonts w:ascii="Symbol" w:hAnsi="Symbol" w:hint="default"/>
+        <w:sz w:val="20"/>
+      </w:rPr>
+    </w:lvl>
+    <w:lvl w:ilvl="7" w:tentative="1">
+      <w:start w:val="1"/>
+      <w:numFmt w:val="bullet"/>
+      <w:lvlText w:val=""/>
+      <w:lvlJc w:val="left"/>
+      <w:pPr>
+        <w:tabs>
+          <w:tab w:val="num" w:pos="5760"/>
+        </w:tabs>
+        <w:ind w:left="5760" w:hanging="360"/>
+      </w:pPr>
+      <w:rPr>
+        <w:rFonts w:ascii="Symbol" w:hAnsi="Symbol" w:hint="default"/>
+        <w:sz w:val="20"/>
+      </w:rPr>
+    </w:lvl>
+    <w:lvl w:ilvl="8" w:tentative="1">
+      <w:start w:val="1"/>
+      <w:numFmt w:val="bullet"/>
+      <w:lvlText w:val=""/>
+      <w:lvlJc w:val="left"/>
+      <w:pPr>
+        <w:tabs>
+          <w:tab w:val="num" w:pos="6480"/>
+        </w:tabs>
+        <w:ind w:left="6480" w:hanging="360"/>
+      </w:pPr>
+      <w:rPr>
+        <w:rFonts w:ascii="Symbol" w:hAnsi="Symbol" w:hint="default"/>
+        <w:sz w:val="20"/>
+      </w:rPr>
+    </w:lvl>
+  </w:abstractNum>
+  <w:abstractNum w:abstractNumId="2" w15:restartNumberingAfterBreak="0">
     <w:nsid w:val="0B7957F6"/>
     <w:multiLevelType w:val="multilevel"/>
     <w:tmpl w:val="8676F206"/>
@@ -1976,7 +2814,120 @@
       </w:rPr>
     </w:lvl>
   </w:abstractNum>
-  <w:abstractNum w:abstractNumId="2" w15:restartNumberingAfterBreak="0">
+  <w:abstractNum w:abstractNumId="3" w15:restartNumberingAfterBreak="0">
+    <w:nsid w:val="0C391CE8"/>
+    <w:multiLevelType w:val="multilevel"/>
+    <w:tmpl w:val="62DC09B8"/>
+    <w:lvl w:ilvl="0">
+      <w:start w:val="1"/>
+      <w:numFmt w:val="decimal"/>
+      <w:lvlText w:val="%1."/>
+      <w:lvlJc w:val="left"/>
+      <w:pPr>
+        <w:tabs>
+          <w:tab w:val="num" w:pos="720"/>
+        </w:tabs>
+        <w:ind w:left="720" w:hanging="360"/>
+      </w:pPr>
+    </w:lvl>
+    <w:lvl w:ilvl="1" w:tentative="1">
+      <w:start w:val="1"/>
+      <w:numFmt w:val="decimal"/>
+      <w:lvlText w:val="%2."/>
+      <w:lvlJc w:val="left"/>
+      <w:pPr>
+        <w:tabs>
+          <w:tab w:val="num" w:pos="1440"/>
+        </w:tabs>
+        <w:ind w:left="1440" w:hanging="360"/>
+      </w:pPr>
+    </w:lvl>
+    <w:lvl w:ilvl="2" w:tentative="1">
+      <w:start w:val="1"/>
+      <w:numFmt w:val="decimal"/>
+      <w:lvlText w:val="%3."/>
+      <w:lvlJc w:val="left"/>
+      <w:pPr>
+        <w:tabs>
+          <w:tab w:val="num" w:pos="2160"/>
+        </w:tabs>
+        <w:ind w:left="2160" w:hanging="360"/>
+      </w:pPr>
+    </w:lvl>
+    <w:lvl w:ilvl="3" w:tentative="1">
+      <w:start w:val="1"/>
+      <w:numFmt w:val="decimal"/>
+      <w:lvlText w:val="%4."/>
+      <w:lvlJc w:val="left"/>
+      <w:pPr>
+        <w:tabs>
+          <w:tab w:val="num" w:pos="2880"/>
+        </w:tabs>
+        <w:ind w:left="2880" w:hanging="360"/>
+      </w:pPr>
+    </w:lvl>
+    <w:lvl w:ilvl="4" w:tentative="1">
+      <w:start w:val="1"/>
+      <w:numFmt w:val="decimal"/>
+      <w:lvlText w:val="%5."/>
+      <w:lvlJc w:val="left"/>
+      <w:pPr>
+        <w:tabs>
+          <w:tab w:val="num" w:pos="3600"/>
+        </w:tabs>
+        <w:ind w:left="3600" w:hanging="360"/>
+      </w:pPr>
+    </w:lvl>
+    <w:lvl w:ilvl="5" w:tentative="1">
+      <w:start w:val="1"/>
+      <w:numFmt w:val="decimal"/>
+      <w:lvlText w:val="%6."/>
+      <w:lvlJc w:val="left"/>
+      <w:pPr>
+        <w:tabs>
+          <w:tab w:val="num" w:pos="4320"/>
+        </w:tabs>
+        <w:ind w:left="4320" w:hanging="360"/>
+      </w:pPr>
+    </w:lvl>
+    <w:lvl w:ilvl="6" w:tentative="1">
+      <w:start w:val="1"/>
+      <w:numFmt w:val="decimal"/>
+      <w:lvlText w:val="%7."/>
+      <w:lvlJc w:val="left"/>
+      <w:pPr>
+        <w:tabs>
+          <w:tab w:val="num" w:pos="5040"/>
+        </w:tabs>
+        <w:ind w:left="5040" w:hanging="360"/>
+      </w:pPr>
+    </w:lvl>
+    <w:lvl w:ilvl="7" w:tentative="1">
+      <w:start w:val="1"/>
+      <w:numFmt w:val="decimal"/>
+      <w:lvlText w:val="%8."/>
+      <w:lvlJc w:val="left"/>
+      <w:pPr>
+        <w:tabs>
+          <w:tab w:val="num" w:pos="5760"/>
+        </w:tabs>
+        <w:ind w:left="5760" w:hanging="360"/>
+      </w:pPr>
+    </w:lvl>
+    <w:lvl w:ilvl="8" w:tentative="1">
+      <w:start w:val="1"/>
+      <w:numFmt w:val="decimal"/>
+      <w:lvlText w:val="%9."/>
+      <w:lvlJc w:val="left"/>
+      <w:pPr>
+        <w:tabs>
+          <w:tab w:val="num" w:pos="6480"/>
+        </w:tabs>
+        <w:ind w:left="6480" w:hanging="360"/>
+      </w:pPr>
+    </w:lvl>
+  </w:abstractNum>
+  <w:abstractNum w:abstractNumId="4" w15:restartNumberingAfterBreak="0">
     <w:nsid w:val="13ED3201"/>
     <w:multiLevelType w:val="hybridMultilevel"/>
     <w:tmpl w:val="0FC42B68"/>
@@ -2089,7 +3040,7 @@
       </w:rPr>
     </w:lvl>
   </w:abstractNum>
-  <w:abstractNum w:abstractNumId="3" w15:restartNumberingAfterBreak="0">
+  <w:abstractNum w:abstractNumId="5" w15:restartNumberingAfterBreak="0">
     <w:nsid w:val="13EE51DE"/>
     <w:multiLevelType w:val="multilevel"/>
     <w:tmpl w:val="13B089FA"/>
@@ -2238,7 +3189,7 @@
       </w:rPr>
     </w:lvl>
   </w:abstractNum>
-  <w:abstractNum w:abstractNumId="4" w15:restartNumberingAfterBreak="0">
+  <w:abstractNum w:abstractNumId="6" w15:restartNumberingAfterBreak="0">
     <w:nsid w:val="15BC0B63"/>
     <w:multiLevelType w:val="multilevel"/>
     <w:tmpl w:val="EC90FB9E"/>
@@ -2351,7 +3302,7 @@
       </w:pPr>
     </w:lvl>
   </w:abstractNum>
-  <w:abstractNum w:abstractNumId="5" w15:restartNumberingAfterBreak="0">
+  <w:abstractNum w:abstractNumId="7" w15:restartNumberingAfterBreak="0">
     <w:nsid w:val="16585F53"/>
     <w:multiLevelType w:val="hybridMultilevel"/>
     <w:tmpl w:val="495838B8"/>
@@ -2464,7 +3415,7 @@
       </w:rPr>
     </w:lvl>
   </w:abstractNum>
-  <w:abstractNum w:abstractNumId="6" w15:restartNumberingAfterBreak="0">
+  <w:abstractNum w:abstractNumId="8" w15:restartNumberingAfterBreak="0">
     <w:nsid w:val="199D439E"/>
     <w:multiLevelType w:val="multilevel"/>
     <w:tmpl w:val="ADBC750C"/>
@@ -2613,7 +3564,7 @@
       </w:rPr>
     </w:lvl>
   </w:abstractNum>
-  <w:abstractNum w:abstractNumId="7" w15:restartNumberingAfterBreak="0">
+  <w:abstractNum w:abstractNumId="9" w15:restartNumberingAfterBreak="0">
     <w:nsid w:val="1E611DFC"/>
     <w:multiLevelType w:val="multilevel"/>
     <w:tmpl w:val="0582AC56"/>
@@ -2762,7 +3713,7 @@
       </w:rPr>
     </w:lvl>
   </w:abstractNum>
-  <w:abstractNum w:abstractNumId="8" w15:restartNumberingAfterBreak="0">
+  <w:abstractNum w:abstractNumId="10" w15:restartNumberingAfterBreak="0">
     <w:nsid w:val="26FE0A4B"/>
     <w:multiLevelType w:val="multilevel"/>
     <w:tmpl w:val="23E0C764"/>
@@ -2875,7 +3826,7 @@
       </w:pPr>
     </w:lvl>
   </w:abstractNum>
-  <w:abstractNum w:abstractNumId="9" w15:restartNumberingAfterBreak="0">
+  <w:abstractNum w:abstractNumId="11" w15:restartNumberingAfterBreak="0">
     <w:nsid w:val="2C493708"/>
     <w:multiLevelType w:val="multilevel"/>
     <w:tmpl w:val="F17EFAC2"/>
@@ -3024,7 +3975,7 @@
       </w:rPr>
     </w:lvl>
   </w:abstractNum>
-  <w:abstractNum w:abstractNumId="10" w15:restartNumberingAfterBreak="0">
+  <w:abstractNum w:abstractNumId="12" w15:restartNumberingAfterBreak="0">
     <w:nsid w:val="36E2363E"/>
     <w:multiLevelType w:val="multilevel"/>
     <w:tmpl w:val="4CBADFC4"/>
@@ -3173,7 +4124,7 @@
       </w:rPr>
     </w:lvl>
   </w:abstractNum>
-  <w:abstractNum w:abstractNumId="11" w15:restartNumberingAfterBreak="0">
+  <w:abstractNum w:abstractNumId="13" w15:restartNumberingAfterBreak="0">
     <w:nsid w:val="38AD15AA"/>
     <w:multiLevelType w:val="multilevel"/>
     <w:tmpl w:val="A4C6C104"/>
@@ -3322,7 +4273,7 @@
       </w:rPr>
     </w:lvl>
   </w:abstractNum>
-  <w:abstractNum w:abstractNumId="12" w15:restartNumberingAfterBreak="0">
+  <w:abstractNum w:abstractNumId="14" w15:restartNumberingAfterBreak="0">
     <w:nsid w:val="40250D89"/>
     <w:multiLevelType w:val="multilevel"/>
     <w:tmpl w:val="F176DA98"/>
@@ -3435,7 +4386,7 @@
       </w:pPr>
     </w:lvl>
   </w:abstractNum>
-  <w:abstractNum w:abstractNumId="13" w15:restartNumberingAfterBreak="0">
+  <w:abstractNum w:abstractNumId="15" w15:restartNumberingAfterBreak="0">
     <w:nsid w:val="4230776A"/>
     <w:multiLevelType w:val="multilevel"/>
     <w:tmpl w:val="D05ABFC6"/>
@@ -3548,7 +4499,156 @@
       </w:rPr>
     </w:lvl>
   </w:abstractNum>
-  <w:abstractNum w:abstractNumId="14" w15:restartNumberingAfterBreak="0">
+  <w:abstractNum w:abstractNumId="16" w15:restartNumberingAfterBreak="0">
+    <w:nsid w:val="43B11D7B"/>
+    <w:multiLevelType w:val="multilevel"/>
+    <w:tmpl w:val="53B0F59E"/>
+    <w:lvl w:ilvl="0">
+      <w:start w:val="1"/>
+      <w:numFmt w:val="bullet"/>
+      <w:lvlText w:val=""/>
+      <w:lvlJc w:val="left"/>
+      <w:pPr>
+        <w:tabs>
+          <w:tab w:val="num" w:pos="720"/>
+        </w:tabs>
+        <w:ind w:left="720" w:hanging="360"/>
+      </w:pPr>
+      <w:rPr>
+        <w:rFonts w:ascii="Symbol" w:hAnsi="Symbol" w:hint="default"/>
+        <w:sz w:val="20"/>
+      </w:rPr>
+    </w:lvl>
+    <w:lvl w:ilvl="1" w:tentative="1">
+      <w:start w:val="1"/>
+      <w:numFmt w:val="bullet"/>
+      <w:lvlText w:val=""/>
+      <w:lvlJc w:val="left"/>
+      <w:pPr>
+        <w:tabs>
+          <w:tab w:val="num" w:pos="1440"/>
+        </w:tabs>
+        <w:ind w:left="1440" w:hanging="360"/>
+      </w:pPr>
+      <w:rPr>
+        <w:rFonts w:ascii="Symbol" w:hAnsi="Symbol" w:hint="default"/>
+        <w:sz w:val="20"/>
+      </w:rPr>
+    </w:lvl>
+    <w:lvl w:ilvl="2" w:tentative="1">
+      <w:start w:val="1"/>
+      <w:numFmt w:val="bullet"/>
+      <w:lvlText w:val=""/>
+      <w:lvlJc w:val="left"/>
+      <w:pPr>
+        <w:tabs>
+          <w:tab w:val="num" w:pos="2160"/>
+        </w:tabs>
+        <w:ind w:left="2160" w:hanging="360"/>
+      </w:pPr>
+      <w:rPr>
+        <w:rFonts w:ascii="Symbol" w:hAnsi="Symbol" w:hint="default"/>
+        <w:sz w:val="20"/>
+      </w:rPr>
+    </w:lvl>
+    <w:lvl w:ilvl="3" w:tentative="1">
+      <w:start w:val="1"/>
+      <w:numFmt w:val="bullet"/>
+      <w:lvlText w:val=""/>
+      <w:lvlJc w:val="left"/>
+      <w:pPr>
+        <w:tabs>
+          <w:tab w:val="num" w:pos="2880"/>
+        </w:tabs>
+        <w:ind w:left="2880" w:hanging="360"/>
+      </w:pPr>
+      <w:rPr>
+        <w:rFonts w:ascii="Symbol" w:hAnsi="Symbol" w:hint="default"/>
+        <w:sz w:val="20"/>
+      </w:rPr>
+    </w:lvl>
+    <w:lvl w:ilvl="4" w:tentative="1">
+      <w:start w:val="1"/>
+      <w:numFmt w:val="bullet"/>
+      <w:lvlText w:val=""/>
+      <w:lvlJc w:val="left"/>
+      <w:pPr>
+        <w:tabs>
+          <w:tab w:val="num" w:pos="3600"/>
+        </w:tabs>
+        <w:ind w:left="3600" w:hanging="360"/>
+      </w:pPr>
+      <w:rPr>
+        <w:rFonts w:ascii="Symbol" w:hAnsi="Symbol" w:hint="default"/>
+        <w:sz w:val="20"/>
+      </w:rPr>
+    </w:lvl>
+    <w:lvl w:ilvl="5" w:tentative="1">
+      <w:start w:val="1"/>
+      <w:numFmt w:val="bullet"/>
+      <w:lvlText w:val=""/>
+      <w:lvlJc w:val="left"/>
+      <w:pPr>
+        <w:tabs>
+          <w:tab w:val="num" w:pos="4320"/>
+        </w:tabs>
+        <w:ind w:left="4320" w:hanging="360"/>
+      </w:pPr>
+      <w:rPr>
+        <w:rFonts w:ascii="Symbol" w:hAnsi="Symbol" w:hint="default"/>
+        <w:sz w:val="20"/>
+      </w:rPr>
+    </w:lvl>
+    <w:lvl w:ilvl="6" w:tentative="1">
+      <w:start w:val="1"/>
+      <w:numFmt w:val="bullet"/>
+      <w:lvlText w:val=""/>
+      <w:lvlJc w:val="left"/>
+      <w:pPr>
+        <w:tabs>
+          <w:tab w:val="num" w:pos="5040"/>
+        </w:tabs>
+        <w:ind w:left="5040" w:hanging="360"/>
+      </w:pPr>
+      <w:rPr>
+        <w:rFonts w:ascii="Symbol" w:hAnsi="Symbol" w:hint="default"/>
+        <w:sz w:val="20"/>
+      </w:rPr>
+    </w:lvl>
+    <w:lvl w:ilvl="7" w:tentative="1">
+      <w:start w:val="1"/>
+      <w:numFmt w:val="bullet"/>
+      <w:lvlText w:val=""/>
+      <w:lvlJc w:val="left"/>
+      <w:pPr>
+        <w:tabs>
+          <w:tab w:val="num" w:pos="5760"/>
+        </w:tabs>
+        <w:ind w:left="5760" w:hanging="360"/>
+      </w:pPr>
+      <w:rPr>
+        <w:rFonts w:ascii="Symbol" w:hAnsi="Symbol" w:hint="default"/>
+        <w:sz w:val="20"/>
+      </w:rPr>
+    </w:lvl>
+    <w:lvl w:ilvl="8" w:tentative="1">
+      <w:start w:val="1"/>
+      <w:numFmt w:val="bullet"/>
+      <w:lvlText w:val=""/>
+      <w:lvlJc w:val="left"/>
+      <w:pPr>
+        <w:tabs>
+          <w:tab w:val="num" w:pos="6480"/>
+        </w:tabs>
+        <w:ind w:left="6480" w:hanging="360"/>
+      </w:pPr>
+      <w:rPr>
+        <w:rFonts w:ascii="Symbol" w:hAnsi="Symbol" w:hint="default"/>
+        <w:sz w:val="20"/>
+      </w:rPr>
+    </w:lvl>
+  </w:abstractNum>
+  <w:abstractNum w:abstractNumId="17" w15:restartNumberingAfterBreak="0">
     <w:nsid w:val="529A2836"/>
     <w:multiLevelType w:val="multilevel"/>
     <w:tmpl w:val="96862982"/>
@@ -3697,7 +4797,7 @@
       </w:rPr>
     </w:lvl>
   </w:abstractNum>
-  <w:abstractNum w:abstractNumId="15" w15:restartNumberingAfterBreak="0">
+  <w:abstractNum w:abstractNumId="18" w15:restartNumberingAfterBreak="0">
     <w:nsid w:val="59321043"/>
     <w:multiLevelType w:val="multilevel"/>
     <w:tmpl w:val="03EE1F9A"/>
@@ -3810,7 +4910,120 @@
       </w:pPr>
     </w:lvl>
   </w:abstractNum>
-  <w:abstractNum w:abstractNumId="16" w15:restartNumberingAfterBreak="0">
+  <w:abstractNum w:abstractNumId="19" w15:restartNumberingAfterBreak="0">
+    <w:nsid w:val="6EC54852"/>
+    <w:multiLevelType w:val="multilevel"/>
+    <w:tmpl w:val="58C040EC"/>
+    <w:lvl w:ilvl="0">
+      <w:start w:val="1"/>
+      <w:numFmt w:val="decimal"/>
+      <w:lvlText w:val="%1."/>
+      <w:lvlJc w:val="left"/>
+      <w:pPr>
+        <w:tabs>
+          <w:tab w:val="num" w:pos="720"/>
+        </w:tabs>
+        <w:ind w:left="720" w:hanging="360"/>
+      </w:pPr>
+    </w:lvl>
+    <w:lvl w:ilvl="1" w:tentative="1">
+      <w:start w:val="1"/>
+      <w:numFmt w:val="decimal"/>
+      <w:lvlText w:val="%2."/>
+      <w:lvlJc w:val="left"/>
+      <w:pPr>
+        <w:tabs>
+          <w:tab w:val="num" w:pos="1440"/>
+        </w:tabs>
+        <w:ind w:left="1440" w:hanging="360"/>
+      </w:pPr>
+    </w:lvl>
+    <w:lvl w:ilvl="2" w:tentative="1">
+      <w:start w:val="1"/>
+      <w:numFmt w:val="decimal"/>
+      <w:lvlText w:val="%3."/>
+      <w:lvlJc w:val="left"/>
+      <w:pPr>
+        <w:tabs>
+          <w:tab w:val="num" w:pos="2160"/>
+        </w:tabs>
+        <w:ind w:left="2160" w:hanging="360"/>
+      </w:pPr>
+    </w:lvl>
+    <w:lvl w:ilvl="3" w:tentative="1">
+      <w:start w:val="1"/>
+      <w:numFmt w:val="decimal"/>
+      <w:lvlText w:val="%4."/>
+      <w:lvlJc w:val="left"/>
+      <w:pPr>
+        <w:tabs>
+          <w:tab w:val="num" w:pos="2880"/>
+        </w:tabs>
+        <w:ind w:left="2880" w:hanging="360"/>
+      </w:pPr>
+    </w:lvl>
+    <w:lvl w:ilvl="4" w:tentative="1">
+      <w:start w:val="1"/>
+      <w:numFmt w:val="decimal"/>
+      <w:lvlText w:val="%5."/>
+      <w:lvlJc w:val="left"/>
+      <w:pPr>
+        <w:tabs>
+          <w:tab w:val="num" w:pos="3600"/>
+        </w:tabs>
+        <w:ind w:left="3600" w:hanging="360"/>
+      </w:pPr>
+    </w:lvl>
+    <w:lvl w:ilvl="5" w:tentative="1">
+      <w:start w:val="1"/>
+      <w:numFmt w:val="decimal"/>
+      <w:lvlText w:val="%6."/>
+      <w:lvlJc w:val="left"/>
+      <w:pPr>
+        <w:tabs>
+          <w:tab w:val="num" w:pos="4320"/>
+        </w:tabs>
+        <w:ind w:left="4320" w:hanging="360"/>
+      </w:pPr>
+    </w:lvl>
+    <w:lvl w:ilvl="6" w:tentative="1">
+      <w:start w:val="1"/>
+      <w:numFmt w:val="decimal"/>
+      <w:lvlText w:val="%7."/>
+      <w:lvlJc w:val="left"/>
+      <w:pPr>
+        <w:tabs>
+          <w:tab w:val="num" w:pos="5040"/>
+        </w:tabs>
+        <w:ind w:left="5040" w:hanging="360"/>
+      </w:pPr>
+    </w:lvl>
+    <w:lvl w:ilvl="7" w:tentative="1">
+      <w:start w:val="1"/>
+      <w:numFmt w:val="decimal"/>
+      <w:lvlText w:val="%8."/>
+      <w:lvlJc w:val="left"/>
+      <w:pPr>
+        <w:tabs>
+          <w:tab w:val="num" w:pos="5760"/>
+        </w:tabs>
+        <w:ind w:left="5760" w:hanging="360"/>
+      </w:pPr>
+    </w:lvl>
+    <w:lvl w:ilvl="8" w:tentative="1">
+      <w:start w:val="1"/>
+      <w:numFmt w:val="decimal"/>
+      <w:lvlText w:val="%9."/>
+      <w:lvlJc w:val="left"/>
+      <w:pPr>
+        <w:tabs>
+          <w:tab w:val="num" w:pos="6480"/>
+        </w:tabs>
+        <w:ind w:left="6480" w:hanging="360"/>
+      </w:pPr>
+    </w:lvl>
+  </w:abstractNum>
+  <w:abstractNum w:abstractNumId="20" w15:restartNumberingAfterBreak="0">
     <w:nsid w:val="75231657"/>
     <w:multiLevelType w:val="hybridMultilevel"/>
     <w:tmpl w:val="DBB8D046"/>
@@ -3923,7 +5136,7 @@
       </w:rPr>
     </w:lvl>
   </w:abstractNum>
-  <w:abstractNum w:abstractNumId="17" w15:restartNumberingAfterBreak="0">
+  <w:abstractNum w:abstractNumId="21" w15:restartNumberingAfterBreak="0">
     <w:nsid w:val="774C713D"/>
     <w:multiLevelType w:val="multilevel"/>
     <w:tmpl w:val="04C6667A"/>
@@ -4072,7 +5285,7 @@
       </w:rPr>
     </w:lvl>
   </w:abstractNum>
-  <w:abstractNum w:abstractNumId="18" w15:restartNumberingAfterBreak="0">
+  <w:abstractNum w:abstractNumId="22" w15:restartNumberingAfterBreak="0">
     <w:nsid w:val="77507E57"/>
     <w:multiLevelType w:val="multilevel"/>
     <w:tmpl w:val="3F60BE2E"/>
@@ -4185,7 +5398,7 @@
       </w:rPr>
     </w:lvl>
   </w:abstractNum>
-  <w:abstractNum w:abstractNumId="19" w15:restartNumberingAfterBreak="0">
+  <w:abstractNum w:abstractNumId="23" w15:restartNumberingAfterBreak="0">
     <w:nsid w:val="7AC361DC"/>
     <w:multiLevelType w:val="hybridMultilevel"/>
     <w:tmpl w:val="17D22ADE"/>
@@ -4271,65 +5484,193 @@
       </w:pPr>
     </w:lvl>
   </w:abstractNum>
+  <w:abstractNum w:abstractNumId="24" w15:restartNumberingAfterBreak="0">
+    <w:nsid w:val="7D794BB0"/>
+    <w:multiLevelType w:val="multilevel"/>
+    <w:tmpl w:val="CBFE6014"/>
+    <w:lvl w:ilvl="0">
+      <w:start w:val="1"/>
+      <w:numFmt w:val="decimal"/>
+      <w:lvlText w:val="%1."/>
+      <w:lvlJc w:val="left"/>
+      <w:pPr>
+        <w:tabs>
+          <w:tab w:val="num" w:pos="720"/>
+        </w:tabs>
+        <w:ind w:left="720" w:hanging="360"/>
+      </w:pPr>
+    </w:lvl>
+    <w:lvl w:ilvl="1" w:tentative="1">
+      <w:start w:val="1"/>
+      <w:numFmt w:val="decimal"/>
+      <w:lvlText w:val="%2."/>
+      <w:lvlJc w:val="left"/>
+      <w:pPr>
+        <w:tabs>
+          <w:tab w:val="num" w:pos="1440"/>
+        </w:tabs>
+        <w:ind w:left="1440" w:hanging="360"/>
+      </w:pPr>
+    </w:lvl>
+    <w:lvl w:ilvl="2" w:tentative="1">
+      <w:start w:val="1"/>
+      <w:numFmt w:val="decimal"/>
+      <w:lvlText w:val="%3."/>
+      <w:lvlJc w:val="left"/>
+      <w:pPr>
+        <w:tabs>
+          <w:tab w:val="num" w:pos="2160"/>
+        </w:tabs>
+        <w:ind w:left="2160" w:hanging="360"/>
+      </w:pPr>
+    </w:lvl>
+    <w:lvl w:ilvl="3" w:tentative="1">
+      <w:start w:val="1"/>
+      <w:numFmt w:val="decimal"/>
+      <w:lvlText w:val="%4."/>
+      <w:lvlJc w:val="left"/>
+      <w:pPr>
+        <w:tabs>
+          <w:tab w:val="num" w:pos="2880"/>
+        </w:tabs>
+        <w:ind w:left="2880" w:hanging="360"/>
+      </w:pPr>
+    </w:lvl>
+    <w:lvl w:ilvl="4" w:tentative="1">
+      <w:start w:val="1"/>
+      <w:numFmt w:val="decimal"/>
+      <w:lvlText w:val="%5."/>
+      <w:lvlJc w:val="left"/>
+      <w:pPr>
+        <w:tabs>
+          <w:tab w:val="num" w:pos="3600"/>
+        </w:tabs>
+        <w:ind w:left="3600" w:hanging="360"/>
+      </w:pPr>
+    </w:lvl>
+    <w:lvl w:ilvl="5" w:tentative="1">
+      <w:start w:val="1"/>
+      <w:numFmt w:val="decimal"/>
+      <w:lvlText w:val="%6."/>
+      <w:lvlJc w:val="left"/>
+      <w:pPr>
+        <w:tabs>
+          <w:tab w:val="num" w:pos="4320"/>
+        </w:tabs>
+        <w:ind w:left="4320" w:hanging="360"/>
+      </w:pPr>
+    </w:lvl>
+    <w:lvl w:ilvl="6" w:tentative="1">
+      <w:start w:val="1"/>
+      <w:numFmt w:val="decimal"/>
+      <w:lvlText w:val="%7."/>
+      <w:lvlJc w:val="left"/>
+      <w:pPr>
+        <w:tabs>
+          <w:tab w:val="num" w:pos="5040"/>
+        </w:tabs>
+        <w:ind w:left="5040" w:hanging="360"/>
+      </w:pPr>
+    </w:lvl>
+    <w:lvl w:ilvl="7" w:tentative="1">
+      <w:start w:val="1"/>
+      <w:numFmt w:val="decimal"/>
+      <w:lvlText w:val="%8."/>
+      <w:lvlJc w:val="left"/>
+      <w:pPr>
+        <w:tabs>
+          <w:tab w:val="num" w:pos="5760"/>
+        </w:tabs>
+        <w:ind w:left="5760" w:hanging="360"/>
+      </w:pPr>
+    </w:lvl>
+    <w:lvl w:ilvl="8" w:tentative="1">
+      <w:start w:val="1"/>
+      <w:numFmt w:val="decimal"/>
+      <w:lvlText w:val="%9."/>
+      <w:lvlJc w:val="left"/>
+      <w:pPr>
+        <w:tabs>
+          <w:tab w:val="num" w:pos="6480"/>
+        </w:tabs>
+        <w:ind w:left="6480" w:hanging="360"/>
+      </w:pPr>
+    </w:lvl>
+  </w:abstractNum>
   <w:num w:numId="1" w16cid:durableId="631255882">
-    <w:abstractNumId w:val="1"/>
+    <w:abstractNumId w:val="2"/>
   </w:num>
   <w:num w:numId="2" w16cid:durableId="397559584">
+    <w:abstractNumId w:val="15"/>
+  </w:num>
+  <w:num w:numId="3" w16cid:durableId="725378493">
+    <w:abstractNumId w:val="22"/>
+  </w:num>
+  <w:num w:numId="4" w16cid:durableId="2133865065">
+    <w:abstractNumId w:val="4"/>
+  </w:num>
+  <w:num w:numId="5" w16cid:durableId="1984655351">
+    <w:abstractNumId w:val="8"/>
+  </w:num>
+  <w:num w:numId="6" w16cid:durableId="1496535355">
+    <w:abstractNumId w:val="11"/>
+  </w:num>
+  <w:num w:numId="7" w16cid:durableId="1561867745">
+    <w:abstractNumId w:val="5"/>
+  </w:num>
+  <w:num w:numId="8" w16cid:durableId="750201910">
     <w:abstractNumId w:val="13"/>
   </w:num>
-  <w:num w:numId="3" w16cid:durableId="725378493">
+  <w:num w:numId="9" w16cid:durableId="1604534457">
+    <w:abstractNumId w:val="17"/>
+  </w:num>
+  <w:num w:numId="10" w16cid:durableId="1470246900">
+    <w:abstractNumId w:val="14"/>
+  </w:num>
+  <w:num w:numId="11" w16cid:durableId="1574580060">
     <w:abstractNumId w:val="18"/>
   </w:num>
-  <w:num w:numId="4" w16cid:durableId="2133865065">
-    <w:abstractNumId w:val="2"/>
-  </w:num>
-  <w:num w:numId="5" w16cid:durableId="1984655351">
-    <w:abstractNumId w:val="6"/>
-  </w:num>
-  <w:num w:numId="6" w16cid:durableId="1496535355">
-    <w:abstractNumId w:val="9"/>
-  </w:num>
-  <w:num w:numId="7" w16cid:durableId="1561867745">
-    <w:abstractNumId w:val="3"/>
-  </w:num>
-  <w:num w:numId="8" w16cid:durableId="750201910">
-    <w:abstractNumId w:val="11"/>
-  </w:num>
-  <w:num w:numId="9" w16cid:durableId="1604534457">
-    <w:abstractNumId w:val="14"/>
-  </w:num>
-  <w:num w:numId="10" w16cid:durableId="1470246900">
-    <w:abstractNumId w:val="12"/>
-  </w:num>
-  <w:num w:numId="11" w16cid:durableId="1574580060">
-    <w:abstractNumId w:val="15"/>
-  </w:num>
   <w:num w:numId="12" w16cid:durableId="2016760276">
-    <w:abstractNumId w:val="8"/>
+    <w:abstractNumId w:val="10"/>
   </w:num>
   <w:num w:numId="13" w16cid:durableId="1916619691">
     <w:abstractNumId w:val="0"/>
   </w:num>
   <w:num w:numId="14" w16cid:durableId="1429229965">
-    <w:abstractNumId w:val="4"/>
+    <w:abstractNumId w:val="6"/>
   </w:num>
   <w:num w:numId="15" w16cid:durableId="1444421365">
-    <w:abstractNumId w:val="17"/>
+    <w:abstractNumId w:val="21"/>
   </w:num>
   <w:num w:numId="16" w16cid:durableId="1615284772">
-    <w:abstractNumId w:val="5"/>
+    <w:abstractNumId w:val="7"/>
   </w:num>
   <w:num w:numId="17" w16cid:durableId="1261377763">
+    <w:abstractNumId w:val="20"/>
+  </w:num>
+  <w:num w:numId="18" w16cid:durableId="85079630">
+    <w:abstractNumId w:val="23"/>
+  </w:num>
+  <w:num w:numId="19" w16cid:durableId="2073385933">
+    <w:abstractNumId w:val="12"/>
+  </w:num>
+  <w:num w:numId="20" w16cid:durableId="2088333840">
+    <w:abstractNumId w:val="9"/>
+  </w:num>
+  <w:num w:numId="21" w16cid:durableId="880551503">
     <w:abstractNumId w:val="16"/>
   </w:num>
-  <w:num w:numId="18" w16cid:durableId="85079630">
+  <w:num w:numId="22" w16cid:durableId="2046590127">
     <w:abstractNumId w:val="19"/>
   </w:num>
-  <w:num w:numId="19" w16cid:durableId="2073385933">
-    <w:abstractNumId w:val="10"/>
+  <w:num w:numId="23" w16cid:durableId="955062270">
+    <w:abstractNumId w:val="1"/>
   </w:num>
-  <w:num w:numId="20" w16cid:durableId="2088333840">
-    <w:abstractNumId w:val="7"/>
+  <w:num w:numId="24" w16cid:durableId="279608835">
+    <w:abstractNumId w:val="3"/>
+  </w:num>
+  <w:num w:numId="25" w16cid:durableId="506942530">
+    <w:abstractNumId w:val="24"/>
   </w:num>
 </w:numbering>
 </file>
@@ -5129,6 +6470,19 @@
       <w:szCs w:val="24"/>
     </w:rPr>
   </w:style>
+  <w:style w:type="paragraph" w:customStyle="1" w:styleId="text-base">
+    <w:name w:val="text-base"/>
+    <w:basedOn w:val="Normal"/>
+    <w:rsid w:val="00097051"/>
+    <w:pPr>
+      <w:spacing w:before="100" w:beforeAutospacing="1" w:after="100" w:afterAutospacing="1" w:line="240" w:lineRule="auto"/>
+    </w:pPr>
+    <w:rPr>
+      <w:rFonts w:ascii="Times New Roman" w:eastAsia="Times New Roman" w:hAnsi="Times New Roman" w:cs="Times New Roman"/>
+      <w:sz w:val="24"/>
+      <w:szCs w:val="24"/>
+    </w:rPr>
+  </w:style>
 </w:styles>
 </file>
 

</xml_diff>

<commit_message>
Atualiza documentação de testes e testes automatizados da API SGVC (#31)
</commit_message>
<xml_diff>
--- a/Documentação/Relatório_de_Sessão_Funcionalidade_Login_Empreendedores_SGVC.docx
+++ b/Documentação/Relatório_de_Sessão_Funcionalidade_Login_Empreendedores_SGVC.docx
@@ -71,7 +71,7 @@
           <w:szCs w:val="24"/>
         </w:rPr>
         <w:drawing>
-          <wp:inline distT="0" distB="0" distL="0" distR="0" wp14:anchorId="01F427D7" wp14:editId="1407CC05">
+          <wp:inline distT="0" distB="0" distL="0" distR="0" wp14:anchorId="01F427D7" wp14:editId="2BC83253">
             <wp:extent cx="5761355" cy="1440180"/>
             <wp:effectExtent l="0" t="0" r="0" b="7620"/>
             <wp:docPr id="21" name="Imagem 21" descr="Interface gráfica do usuário, Texto, Site&#10;&#10;O conteúdo gerado por IA pode estar incorreto."/>
@@ -794,82 +794,271 @@
         <w:t>Notas*:</w:t>
       </w:r>
     </w:p>
-    <w:p>
-      <w:pPr>
-        <w:pStyle w:val="PargrafodaLista"/>
-        <w:rPr>
-          <w:b/>
-          <w:bCs/>
-        </w:rPr>
-      </w:pPr>
-    </w:p>
-    <w:p>
-      <w:pPr>
-        <w:pStyle w:val="PargrafodaLista"/>
-        <w:numPr>
-          <w:ilvl w:val="0"/>
-          <w:numId w:val="16"/>
-        </w:numPr>
-      </w:pPr>
-      <w:r>
-        <w:t>(I) Observei um comportamento inesperado durante a execução, que pode indicar inconsistência no processamento ou apresentação das informações ao usuário.</w:t>
-      </w:r>
-    </w:p>
-    <w:p>
-      <w:pPr>
-        <w:pStyle w:val="PargrafodaLista"/>
-        <w:numPr>
-          <w:ilvl w:val="0"/>
-          <w:numId w:val="16"/>
-        </w:numPr>
-      </w:pPr>
-      <w:r>
-        <w:t>(I) Percebi ausência de feedback imediato após uma ação, o que pode gerar dúvida sobre a conclusão da operação.</w:t>
-      </w:r>
-    </w:p>
-    <w:p>
-      <w:pPr>
-        <w:pStyle w:val="PargrafodaLista"/>
-        <w:numPr>
-          <w:ilvl w:val="0"/>
-          <w:numId w:val="16"/>
-        </w:numPr>
-      </w:pPr>
-      <w:r>
-        <w:t>(R) Caso o sistema não apresente mudanças claras após uma ação crítica, usuários podem repetir procedimentos indevidamente, gerando falhas, inconsistências ou sobrecarga.</w:t>
-      </w:r>
-    </w:p>
-    <w:p>
-      <w:pPr>
-        <w:pStyle w:val="PargrafodaLista"/>
-        <w:numPr>
-          <w:ilvl w:val="0"/>
-          <w:numId w:val="16"/>
-        </w:numPr>
-      </w:pPr>
-      <w:r>
-        <w:t>(I) Identifiquei um ponto onde a execução não completou conforme esperado, sugerindo possível interrupção ou falha de tratamento.</w:t>
-      </w:r>
-    </w:p>
-    <w:p>
-      <w:pPr>
-        <w:pStyle w:val="PargrafodaLista"/>
-        <w:numPr>
-          <w:ilvl w:val="0"/>
-          <w:numId w:val="16"/>
-        </w:numPr>
-      </w:pPr>
-      <w:r>
-        <w:t>(*) Podem ser (I)nformações relevantes ou (R)iscos observados.</w:t>
-      </w:r>
-    </w:p>
-    <w:p>
-      <w:pPr>
-        <w:rPr>
-          <w:b/>
-          <w:bCs/>
-        </w:rPr>
-      </w:pPr>
+    <w:p/>
+    <w:p>
+      <w:pPr>
+        <w:numPr>
+          <w:ilvl w:val="0"/>
+          <w:numId w:val="21"/>
+        </w:numPr>
+      </w:pPr>
+      <w:r>
+        <w:t>(I) Login aceita credenciais inválidas com mensagem genérica; risco de confundir usuário e dificultar suporte.</w:t>
+      </w:r>
+    </w:p>
+    <w:p>
+      <w:pPr>
+        <w:numPr>
+          <w:ilvl w:val="0"/>
+          <w:numId w:val="21"/>
+        </w:numPr>
+      </w:pPr>
+      <w:r>
+        <w:t>(I) Ausência de feedback imediato em tentativas de login (ex.: sem spinner/estado), gerando dúvida se a requisição foi enviada.</w:t>
+      </w:r>
+    </w:p>
+    <w:p>
+      <w:pPr>
+        <w:numPr>
+          <w:ilvl w:val="0"/>
+          <w:numId w:val="21"/>
+        </w:numPr>
+      </w:pPr>
+      <w:r>
+        <w:t>(R) Após erro, não há sinal claro de bloqueio temporário; usuário pode repetir várias vezes e acionar rate limit ou bloqueio de conta.</w:t>
+      </w:r>
+    </w:p>
+    <w:p>
+      <w:pPr>
+        <w:numPr>
+          <w:ilvl w:val="0"/>
+          <w:numId w:val="21"/>
+        </w:numPr>
+      </w:pPr>
+      <w:r>
+        <w:t>(I) Sessão/token pode expirar sem aviso; tentativa seguinte falha sem mensagem clara de “sessão expirada”.</w:t>
+      </w:r>
+    </w:p>
+    <w:p>
+      <w:pPr>
+        <w:numPr>
+          <w:ilvl w:val="0"/>
+          <w:numId w:val="21"/>
+        </w:numPr>
+      </w:pPr>
+      <w:r>
+        <w:t>(I) GET ou Content-Type incorreto no /login retorna erro, mas sem orientação sobre o formato correto; pode causar retrabalho.</w:t>
+      </w:r>
+    </w:p>
+    <w:p>
+      <w:pPr>
+        <w:numPr>
+          <w:ilvl w:val="0"/>
+          <w:numId w:val="21"/>
+        </w:numPr>
+      </w:pPr>
+      <w:r>
+        <w:t>(R) Entradas não normalizadas (sem trim) podem ser rejeitadas ou aceitas de forma inconsistente, afetando a UX e suporte.</w:t>
+      </w:r>
+    </w:p>
+    <w:p>
+      <w:pPr>
+        <w:numPr>
+          <w:ilvl w:val="0"/>
+          <w:numId w:val="21"/>
+        </w:numPr>
+      </w:pPr>
+      <w:r>
+        <w:t>(I) Erros de formato de e-mail ou senha não distinguem campos; usuário não sabe o que corrigir.</w:t>
+      </w:r>
+    </w:p>
+    <w:p>
+      <w:pPr>
+        <w:numPr>
+          <w:ilvl w:val="0"/>
+          <w:numId w:val="21"/>
+        </w:numPr>
+      </w:pPr>
+      <w:r>
+        <w:t>(R) Falta de log/auditoria para tentativas falhas dificulta detecção de brute force.</w:t>
+      </w:r>
+    </w:p>
+    <w:p>
+      <w:pPr>
+        <w:numPr>
+          <w:ilvl w:val="0"/>
+          <w:numId w:val="21"/>
+        </w:numPr>
+      </w:pPr>
+      <w:r>
+        <w:t>(I) Mensagens não deixam claro o motivo do bloqueio (usuário bloqueado vs. rate limit), gerando confusão.</w:t>
+      </w:r>
+    </w:p>
+    <w:p>
+      <w:pPr>
+        <w:numPr>
+          <w:ilvl w:val="0"/>
+          <w:numId w:val="21"/>
+        </w:numPr>
+      </w:pPr>
+      <w:r>
+        <w:t>(I) Não há indicação visual quando o usuário bloqueado tenta login; pode parecer falha de rede.</w:t>
+      </w:r>
+    </w:p>
+    <w:p>
+      <w:pPr>
+        <w:numPr>
+          <w:ilvl w:val="0"/>
+          <w:numId w:val="21"/>
+        </w:numPr>
+      </w:pPr>
+      <w:r>
+        <w:t>(R) Sem confirmação de logout/revogação, o usuário pode acreditar que ainda está logado e gerar inconsistências.</w:t>
+      </w:r>
+    </w:p>
+    <w:p>
+      <w:pPr>
+        <w:numPr>
+          <w:ilvl w:val="0"/>
+          <w:numId w:val="21"/>
+        </w:numPr>
+      </w:pPr>
+      <w:r>
+        <w:t>(I) Campos adicionais no payload são ignorados silenciosamente; usuário pode achar que dados foram salvos.</w:t>
+      </w:r>
+    </w:p>
+    <w:p>
+      <w:pPr>
+        <w:numPr>
+          <w:ilvl w:val="0"/>
+          <w:numId w:val="21"/>
+        </w:numPr>
+      </w:pPr>
+      <w:r>
+        <w:t>(R) Se payload vazio ou parcial não for tratado consistentemente, pode ocorrer crash ou resposta inesperada.</w:t>
+      </w:r>
+    </w:p>
+    <w:p>
+      <w:pPr>
+        <w:numPr>
+          <w:ilvl w:val="0"/>
+          <w:numId w:val="21"/>
+        </w:numPr>
+      </w:pPr>
+      <w:r>
+        <w:t>(I) Tempo limite de sessão não informado; usuário é desconectado sem aviso.</w:t>
+      </w:r>
+    </w:p>
+    <w:p>
+      <w:pPr>
+        <w:numPr>
+          <w:ilvl w:val="0"/>
+          <w:numId w:val="21"/>
+        </w:numPr>
+      </w:pPr>
+      <w:r>
+        <w:t>(R) Mensagens diferentes para e-mail inexistente vs. senha errada podem facilitar enumeração de contas.</w:t>
+      </w:r>
+    </w:p>
+    <w:p>
+      <w:pPr>
+        <w:numPr>
+          <w:ilvl w:val="0"/>
+          <w:numId w:val="21"/>
+        </w:numPr>
+      </w:pPr>
+      <w:r>
+        <w:t>(I) Falta de orientação sobre requisitos de senha (tamanho/máscaras) antes do erro; gera tentativa-e-erro.</w:t>
+      </w:r>
+    </w:p>
+    <w:p>
+      <w:pPr>
+        <w:numPr>
+          <w:ilvl w:val="0"/>
+          <w:numId w:val="21"/>
+        </w:numPr>
+      </w:pPr>
+      <w:r>
+        <w:t>(R) Sem bloqueio pós-3 tentativas (ou sem feedback disso), aumenta risco de força bruta.</w:t>
+      </w:r>
+    </w:p>
+    <w:p>
+      <w:pPr>
+        <w:numPr>
+          <w:ilvl w:val="0"/>
+          <w:numId w:val="21"/>
+        </w:numPr>
+      </w:pPr>
+      <w:r>
+        <w:t>(I) Se o campo senha aceitar tipos não-string, pode gerar erro interno e mensagem genérica.</w:t>
+      </w:r>
+    </w:p>
+    <w:p>
+      <w:pPr>
+        <w:numPr>
+          <w:ilvl w:val="0"/>
+          <w:numId w:val="21"/>
+        </w:numPr>
+      </w:pPr>
+      <w:r>
+        <w:t>(R) Respostas 405/415 sem detalhes podem induzir clientes a usar verbos/headers incorretos repetidamente.</w:t>
+      </w:r>
+    </w:p>
+    <w:p>
+      <w:pPr>
+        <w:numPr>
+          <w:ilvl w:val="0"/>
+          <w:numId w:val="21"/>
+        </w:numPr>
+      </w:pPr>
+      <w:r>
+        <w:t>(I) Não há aviso de que caracteres especiais são permitidos; usuários evitam senhas fortes.</w:t>
+      </w:r>
+    </w:p>
+    <w:p>
+      <w:pPr>
+        <w:numPr>
+          <w:ilvl w:val="0"/>
+          <w:numId w:val="21"/>
+        </w:numPr>
+      </w:pPr>
+      <w:r>
+        <w:t>(R) Tokens não revogados após logout permitem reutilização indevida da sessão.</w:t>
+      </w:r>
+    </w:p>
+    <w:p>
+      <w:pPr>
+        <w:numPr>
+          <w:ilvl w:val="0"/>
+          <w:numId w:val="21"/>
+        </w:numPr>
+      </w:pPr>
+      <w:r>
+        <w:lastRenderedPageBreak/>
+        <w:t>(I) Se a API não devolver error consistente no body, front não consegue exibir mensagem clara.</w:t>
+      </w:r>
+    </w:p>
+    <w:p>
+      <w:pPr>
+        <w:numPr>
+          <w:ilvl w:val="0"/>
+          <w:numId w:val="21"/>
+        </w:numPr>
+      </w:pPr>
+      <w:r>
+        <w:t>(R) Sem limite de tamanho em campos, há risco de DOS ou truncamento inesperado.</w:t>
+      </w:r>
+    </w:p>
+    <w:p>
+      <w:pPr>
+        <w:numPr>
+          <w:ilvl w:val="0"/>
+          <w:numId w:val="21"/>
+        </w:numPr>
+      </w:pPr>
+      <w:r>
+        <w:t>(I) Falta de mensagens localizadas ou padronizadas pode confundir usuários em ambientes multilíngues.</w:t>
+      </w:r>
     </w:p>
     <w:p>
       <w:pPr>
@@ -898,6 +1087,7 @@
         <w:t>(*) Podem ser (I)nformações ou (R)iscos.</w:t>
       </w:r>
     </w:p>
+    <w:p/>
     <w:p>
       <w:pPr>
         <w:rPr>
@@ -913,57 +1103,134 @@
           <w:bCs/>
         </w:rPr>
       </w:pPr>
-      <w:r>
+    </w:p>
+    <w:p>
+      <w:pPr>
         <w:rPr>
           <w:b/>
           <w:bCs/>
         </w:rPr>
-        <w:t>Defeitos:</w:t>
-      </w:r>
-    </w:p>
-    <w:p>
-      <w:pPr>
-        <w:pStyle w:val="NormalWeb"/>
-        <w:numPr>
-          <w:ilvl w:val="0"/>
-          <w:numId w:val="18"/>
-        </w:numPr>
-      </w:pPr>
-      <w:r>
-        <w:t xml:space="preserve"> O rótulo ou mensagem apresentada ao usuário não reflete com precisão a regra de negócio configurada.</w:t>
-      </w:r>
-    </w:p>
-    <w:p>
-      <w:pPr>
-        <w:pStyle w:val="NormalWeb"/>
-        <w:numPr>
-          <w:ilvl w:val="0"/>
-          <w:numId w:val="18"/>
-        </w:numPr>
-      </w:pPr>
-      <w:r>
-        <w:t xml:space="preserve"> Após uma ação importante, o sistema retornou o usuário ao estado anterior ou finalizou a sessão inesperadamente.</w:t>
-      </w:r>
-    </w:p>
-    <w:p>
-      <w:pPr>
-        <w:pStyle w:val="NormalWeb"/>
-        <w:numPr>
-          <w:ilvl w:val="0"/>
-          <w:numId w:val="18"/>
-        </w:numPr>
-      </w:pPr>
-      <w:r>
-        <w:t>O comportamento observado após a operação não corresponde ao resultado esperado ou informado pela regra de negócio.</w:t>
-      </w:r>
-    </w:p>
-    <w:p/>
-    <w:p>
-      <w:pPr>
+      </w:pPr>
+      <w:r>
         <w:rPr>
           <w:b/>
           <w:bCs/>
         </w:rPr>
+        <w:t>Defeitos:</w:t>
+      </w:r>
+    </w:p>
+    <w:p>
+      <w:pPr>
+        <w:pStyle w:val="NormalWeb"/>
+        <w:numPr>
+          <w:ilvl w:val="0"/>
+          <w:numId w:val="18"/>
+        </w:numPr>
+      </w:pPr>
+      <w:r>
+        <w:t>Mensagens de erro não cobrem todos os cenários (ex.: bloqueado, rate limit, sessão expirada) ou não refletem a regra de negócio de forma clara.</w:t>
+      </w:r>
+    </w:p>
+    <w:p>
+      <w:pPr>
+        <w:pStyle w:val="NormalWeb"/>
+        <w:numPr>
+          <w:ilvl w:val="0"/>
+          <w:numId w:val="18"/>
+        </w:numPr>
+      </w:pPr>
+      <w:r>
+        <w:t>Após tentativas críticas (ex.: várias falhas), o sistema pode voltar ao estado anterior ou encerrar sessão sem indicar o motivo (bloqueio, expiração, revogação).</w:t>
+      </w:r>
+    </w:p>
+    <w:p>
+      <w:pPr>
+        <w:pStyle w:val="NormalWeb"/>
+        <w:numPr>
+          <w:ilvl w:val="0"/>
+          <w:numId w:val="18"/>
+        </w:numPr>
+      </w:pPr>
+      <w:r>
+        <w:t>Respostas após operações (POST /login, logout) não correspondem sempre ao comportamento esperado: retorno genérico, ausência de orientação sobre o próximo passo ou inconsistência entre status e body.</w:t>
+      </w:r>
+    </w:p>
+    <w:p>
+      <w:pPr>
+        <w:pStyle w:val="NormalWeb"/>
+        <w:numPr>
+          <w:ilvl w:val="0"/>
+          <w:numId w:val="18"/>
+        </w:numPr>
+      </w:pPr>
+      <w:r>
+        <w:t>Melhorias a implementar:</w:t>
+      </w:r>
+    </w:p>
+    <w:p>
+      <w:pPr>
+        <w:pStyle w:val="NormalWeb"/>
+        <w:numPr>
+          <w:ilvl w:val="0"/>
+          <w:numId w:val="18"/>
+        </w:numPr>
+      </w:pPr>
+      <w:r>
+        <w:t>Padronizar mensagens para cada regra (credencial inválida, bloqueio, rate limit, sessão expirada/revogada, Content-Type inválido, método não permitido), mantendo o mesmo campo error no body.</w:t>
+      </w:r>
+    </w:p>
+    <w:p>
+      <w:pPr>
+        <w:pStyle w:val="NormalWeb"/>
+        <w:numPr>
+          <w:ilvl w:val="0"/>
+          <w:numId w:val="18"/>
+        </w:numPr>
+      </w:pPr>
+      <w:r>
+        <w:t>Garantir feedback imediato no cliente (loading, aviso de erro, instrução de correção) e diferenciar visualmente bloqueio vs. falha de credencial.</w:t>
+      </w:r>
+    </w:p>
+    <w:p>
+      <w:pPr>
+        <w:pStyle w:val="NormalWeb"/>
+        <w:numPr>
+          <w:ilvl w:val="0"/>
+          <w:numId w:val="18"/>
+        </w:numPr>
+      </w:pPr>
+      <w:r>
+        <w:t>Confirmar e informar estado de sessão: expiração por inatividade, logout bem-sucedido com token revogado, e retorno claro quando o token for rejeitado.</w:t>
+      </w:r>
+    </w:p>
+    <w:p>
+      <w:pPr>
+        <w:pStyle w:val="NormalWeb"/>
+        <w:numPr>
+          <w:ilvl w:val="0"/>
+          <w:numId w:val="18"/>
+        </w:numPr>
+      </w:pPr>
+      <w:r>
+        <w:t>Log/auditoria de tentativas (sucesso/falha) para suporte e segurança; proteger contra enumeração de usuários (mensagem uniforme para e-mail inexistente/senha errada).</w:t>
+      </w:r>
+    </w:p>
+    <w:p>
+      <w:pPr>
+        <w:pStyle w:val="NormalWeb"/>
+        <w:numPr>
+          <w:ilvl w:val="0"/>
+          <w:numId w:val="18"/>
+        </w:numPr>
+      </w:pPr>
+      <w:r>
+        <w:t>Validar e normalizar entradas (trim, tipo string, limites de tamanho) e retornar mensagens específicas do campo para reduzir tentativas repetidas.</w:t>
+      </w:r>
+    </w:p>
+    <w:p>
+      <w:pPr>
+        <w:pStyle w:val="NormalWeb"/>
+        <w:ind w:left="720"/>
       </w:pPr>
     </w:p>
     <w:p>
@@ -978,59 +1245,435 @@
           <w:b/>
           <w:bCs/>
         </w:rPr>
-        <w:t>Perguntas:</w:t>
-      </w:r>
-    </w:p>
-    <w:p>
-      <w:pPr>
-        <w:pStyle w:val="NormalWeb"/>
-        <w:numPr>
-          <w:ilvl w:val="0"/>
-          <w:numId w:val="17"/>
-        </w:numPr>
-      </w:pPr>
-      <w:r>
-        <w:t xml:space="preserve"> A ação realizada deve realmente permitir que origem e destino sejam os mesmos?</w:t>
-      </w:r>
-    </w:p>
-    <w:p>
-      <w:pPr>
-        <w:pStyle w:val="NormalWeb"/>
-        <w:numPr>
-          <w:ilvl w:val="0"/>
-          <w:numId w:val="17"/>
-        </w:numPr>
-      </w:pPr>
-      <w:r>
-        <w:t>O sistema deveria apresentar feedback mais claro após essa operação?</w:t>
-      </w:r>
-    </w:p>
-    <w:p>
-      <w:pPr>
-        <w:pStyle w:val="NormalWeb"/>
-        <w:numPr>
-          <w:ilvl w:val="0"/>
-          <w:numId w:val="17"/>
-        </w:numPr>
-      </w:pPr>
-      <w:r>
-        <w:t>Há alguma regra oculta ou não documentada que justifique o comportamento observado?</w:t>
-      </w:r>
-    </w:p>
-    <w:p/>
-    <w:p>
-      <w:pPr>
-        <w:pStyle w:val="Cabealho"/>
+        <w:t>Melhoria a ser implementada</w:t>
+      </w:r>
+      <w:r>
         <w:rPr>
           <w:b/>
           <w:bCs/>
         </w:rPr>
+        <w:t>:</w:t>
+      </w:r>
+    </w:p>
+    <w:p>
+      <w:pPr>
+        <w:rPr>
+          <w:b/>
+          <w:bCs/>
+        </w:rPr>
+      </w:pPr>
+    </w:p>
+    <w:p>
+      <w:r>
+        <w:t>Aqui vão 24 melhorias levantadas a partir dos testes automatizados de login:</w:t>
+      </w:r>
+    </w:p>
+    <w:p/>
+    <w:p>
+      <w:pPr>
+        <w:numPr>
+          <w:ilvl w:val="0"/>
+          <w:numId w:val="24"/>
+        </w:numPr>
+      </w:pPr>
+      <w:r>
+        <w:t>Unificar campo de erro (error) e mensagens conforme regra (credencial inválida, formato de e-mail, senha curta/longa, user bloqueado).</w:t>
+      </w:r>
+    </w:p>
+    <w:p>
+      <w:pPr>
+        <w:numPr>
+          <w:ilvl w:val="0"/>
+          <w:numId w:val="24"/>
+        </w:numPr>
+      </w:pPr>
+      <w:r>
+        <w:t>Trim consistente em e-mail e senha antes de validar e antes de responder.</w:t>
+      </w:r>
+    </w:p>
+    <w:p>
+      <w:pPr>
+        <w:numPr>
+          <w:ilvl w:val="0"/>
+          <w:numId w:val="24"/>
+        </w:numPr>
+      </w:pPr>
+      <w:r>
+        <w:t>Validar tipo string em e-mail e senha; rejeitar arrays/objetos/números.</w:t>
+      </w:r>
+    </w:p>
+    <w:p>
+      <w:pPr>
+        <w:numPr>
+          <w:ilvl w:val="0"/>
+          <w:numId w:val="24"/>
+        </w:numPr>
+      </w:pPr>
+      <w:r>
+        <w:lastRenderedPageBreak/>
+        <w:t>Regex mínima de e-mail (com @ e domínio) aplicada após trim.</w:t>
+      </w:r>
+    </w:p>
+    <w:p>
+      <w:pPr>
+        <w:numPr>
+          <w:ilvl w:val="0"/>
+          <w:numId w:val="24"/>
+        </w:numPr>
+      </w:pPr>
+      <w:r>
+        <w:t>Limites de tamanho da senha (mínimo e máximo) centralizados e documentados.</w:t>
+      </w:r>
+    </w:p>
+    <w:p>
+      <w:pPr>
+        <w:numPr>
+          <w:ilvl w:val="0"/>
+          <w:numId w:val="24"/>
+        </w:numPr>
+      </w:pPr>
+      <w:r>
+        <w:t>Campos obrigatórios: retornar mensagens específicas para e-mail ausente/nulo/vazio.</w:t>
+      </w:r>
+    </w:p>
+    <w:p>
+      <w:pPr>
+        <w:numPr>
+          <w:ilvl w:val="0"/>
+          <w:numId w:val="24"/>
+        </w:numPr>
+      </w:pPr>
+      <w:r>
+        <w:t>Campos obrigatórios: retornar mensagens específicas para senha ausente/nula/vazia.</w:t>
+      </w:r>
+    </w:p>
+    <w:p>
+      <w:pPr>
+        <w:numPr>
+          <w:ilvl w:val="0"/>
+          <w:numId w:val="24"/>
+        </w:numPr>
+      </w:pPr>
+      <w:r>
+        <w:t>Payload vazio: retornar erro único (“E-mail e senha são obrigatórios”).</w:t>
+      </w:r>
+    </w:p>
+    <w:p>
+      <w:pPr>
+        <w:numPr>
+          <w:ilvl w:val="0"/>
+          <w:numId w:val="24"/>
+        </w:numPr>
+      </w:pPr>
+      <w:r>
+        <w:t>Content-Type inválido: responder 415 com orientação de usar application/json.</w:t>
+      </w:r>
+    </w:p>
+    <w:p>
+      <w:pPr>
+        <w:numPr>
+          <w:ilvl w:val="0"/>
+          <w:numId w:val="24"/>
+        </w:numPr>
+      </w:pPr>
+      <w:r>
+        <w:t>Método não permitido (GET /login): responder 405 e não expor detalhes.</w:t>
+      </w:r>
+    </w:p>
+    <w:p>
+      <w:pPr>
+        <w:numPr>
+          <w:ilvl w:val="0"/>
+          <w:numId w:val="24"/>
+        </w:numPr>
+      </w:pPr>
+      <w:r>
+        <w:t>Token/credenciais corretas: garantir retorno 200 com token string.</w:t>
+      </w:r>
+    </w:p>
+    <w:p>
+      <w:pPr>
+        <w:numPr>
+          <w:ilvl w:val="0"/>
+          <w:numId w:val="24"/>
+        </w:numPr>
+      </w:pPr>
+      <w:r>
+        <w:t>Usuário bloqueado: responder 403 com mensagem clara e sem vazar detalhes.</w:t>
+      </w:r>
+    </w:p>
+    <w:p>
+      <w:pPr>
+        <w:numPr>
+          <w:ilvl w:val="0"/>
+          <w:numId w:val="24"/>
+        </w:numPr>
+      </w:pPr>
+      <w:r>
+        <w:t>Rate limit após N falhas: responder 429 e não vazar se o e-mail existe.</w:t>
+      </w:r>
+    </w:p>
+    <w:p>
+      <w:pPr>
+        <w:numPr>
+          <w:ilvl w:val="0"/>
+          <w:numId w:val="24"/>
+        </w:numPr>
+      </w:pPr>
+      <w:r>
+        <w:t>Maiúsculas/minúsculas no e-mail: normalizar e aceitar.</w:t>
+      </w:r>
+    </w:p>
+    <w:p>
+      <w:pPr>
+        <w:numPr>
+          <w:ilvl w:val="0"/>
+          <w:numId w:val="24"/>
+        </w:numPr>
+      </w:pPr>
+      <w:r>
+        <w:t>Senha com caracteres especiais: aceitar sem corromper encoding.</w:t>
+      </w:r>
+    </w:p>
+    <w:p>
+      <w:pPr>
+        <w:numPr>
+          <w:ilvl w:val="0"/>
+          <w:numId w:val="24"/>
+        </w:numPr>
+      </w:pPr>
+      <w:r>
+        <w:t>E-mails com espaços extras: aceitar após trim; sem duplicar usuários.</w:t>
+      </w:r>
+    </w:p>
+    <w:p>
+      <w:pPr>
+        <w:numPr>
+          <w:ilvl w:val="0"/>
+          <w:numId w:val="24"/>
+        </w:numPr>
+      </w:pPr>
+      <w:r>
+        <w:t>Senhas com espaços extras: trim aplicado para autenticar, conforme regra.</w:t>
+      </w:r>
+    </w:p>
+    <w:p>
+      <w:pPr>
+        <w:numPr>
+          <w:ilvl w:val="0"/>
+          <w:numId w:val="24"/>
+        </w:numPr>
+      </w:pPr>
+      <w:r>
+        <w:t>Ignorar campos extras no payload, mas manter autenticação consistente.</w:t>
+      </w:r>
+    </w:p>
+    <w:p>
+      <w:pPr>
+        <w:numPr>
+          <w:ilvl w:val="0"/>
+          <w:numId w:val="24"/>
+        </w:numPr>
+      </w:pPr>
+      <w:r>
+        <w:t>Tratamento de valores numéricos no e-mail: rejeitar com mensagem de formato inválido.</w:t>
+      </w:r>
+    </w:p>
+    <w:p>
+      <w:pPr>
+        <w:numPr>
+          <w:ilvl w:val="0"/>
+          <w:numId w:val="24"/>
+        </w:numPr>
+      </w:pPr>
+      <w:r>
+        <w:t>Tratamento de valores numéricos/array/obj na senha: rejeitar com mensagem de formato inválido.</w:t>
+      </w:r>
+    </w:p>
+    <w:p>
+      <w:pPr>
+        <w:numPr>
+          <w:ilvl w:val="0"/>
+          <w:numId w:val="24"/>
+        </w:numPr>
+      </w:pPr>
+      <w:r>
+        <w:t>Retorno consistente quando e-mail não cadastrado ou senha errada (mesma mensagem 401).</w:t>
+      </w:r>
+    </w:p>
+    <w:p>
+      <w:pPr>
+        <w:numPr>
+          <w:ilvl w:val="0"/>
+          <w:numId w:val="24"/>
+        </w:numPr>
+      </w:pPr>
+      <w:r>
+        <w:t>Bloqueio/timeout de sessão documentado e retornando status coerente (401/403) quando expira.</w:t>
+      </w:r>
+    </w:p>
+    <w:p>
+      <w:pPr>
+        <w:numPr>
+          <w:ilvl w:val="0"/>
+          <w:numId w:val="24"/>
+        </w:numPr>
+      </w:pPr>
+      <w:r>
+        <w:t>Revogação de token no logout e checagem em endpoints autenticados.</w:t>
+      </w:r>
+    </w:p>
+    <w:p>
+      <w:pPr>
+        <w:numPr>
+          <w:ilvl w:val="0"/>
+          <w:numId w:val="24"/>
+        </w:numPr>
+      </w:pPr>
+      <w:r>
+        <w:t>Log/auditoria de tentativas (sucesso/falha) para suporte e detecção de abuso (força bruta).</w:t>
+      </w:r>
+    </w:p>
+    <w:p/>
+    <w:p>
+      <w:pPr>
+        <w:rPr>
+          <w:b/>
+          <w:bCs/>
+        </w:rPr>
+      </w:pPr>
+    </w:p>
+    <w:p>
+      <w:pPr>
+        <w:pStyle w:val="NormalWeb"/>
+        <w:ind w:left="720"/>
+      </w:pPr>
+    </w:p>
+    <w:p/>
+    <w:p>
+      <w:pPr>
+        <w:rPr>
+          <w:b/>
+          <w:bCs/>
+        </w:rPr>
+      </w:pPr>
+    </w:p>
+    <w:p>
+      <w:pPr>
+        <w:rPr>
+          <w:b/>
+          <w:bCs/>
+        </w:rPr>
+      </w:pPr>
+      <w:r>
+        <w:rPr>
+          <w:b/>
+          <w:bCs/>
+        </w:rPr>
+        <w:t>Perguntas:</w:t>
+      </w:r>
+    </w:p>
+    <w:p>
+      <w:pPr>
+        <w:pStyle w:val="NormalWeb"/>
+        <w:numPr>
+          <w:ilvl w:val="0"/>
+          <w:numId w:val="17"/>
+        </w:numPr>
+      </w:pPr>
+      <w:r>
+        <w:t>As mensagens 401/403 devem ser distintas ou sempre genéricas para evitar enumeração de usuários?</w:t>
+      </w:r>
+    </w:p>
+    <w:p>
+      <w:pPr>
+        <w:pStyle w:val="NormalWeb"/>
+        <w:numPr>
+          <w:ilvl w:val="0"/>
+          <w:numId w:val="17"/>
+        </w:numPr>
+      </w:pPr>
+      <w:r>
+        <w:t>O bloqueio por múltiplas falhas deve informar tempo restante ou só dizer “tente mais tarde”?</w:t>
+      </w:r>
+    </w:p>
+    <w:p>
+      <w:pPr>
+        <w:pStyle w:val="NormalWeb"/>
+        <w:numPr>
+          <w:ilvl w:val="0"/>
+          <w:numId w:val="17"/>
+        </w:numPr>
+      </w:pPr>
+      <w:r>
+        <w:lastRenderedPageBreak/>
+        <w:t>Tokens expirados/revogados devem forçar logout automático no cliente ou apenas retornar 401/403 até o usuário renovar?</w:t>
+      </w:r>
+    </w:p>
+    <w:p>
+      <w:pPr>
+        <w:pStyle w:val="NormalWeb"/>
+        <w:numPr>
+          <w:ilvl w:val="0"/>
+          <w:numId w:val="17"/>
+        </w:numPr>
+      </w:pPr>
+      <w:r>
+        <w:t>É aceitável trim na senha (removendo espaços) ou a regra é preservar exatamente o input?</w:t>
+      </w:r>
+    </w:p>
+    <w:p>
+      <w:pPr>
+        <w:pStyle w:val="NormalWeb"/>
+        <w:numPr>
+          <w:ilvl w:val="0"/>
+          <w:numId w:val="17"/>
+        </w:numPr>
+      </w:pPr>
+      <w:r>
+        <w:t>Precisamos exigir MFA/2FA neste fluxo ou manter apenas usuário/senha?</w:t>
+      </w:r>
+    </w:p>
+    <w:p>
+      <w:pPr>
+        <w:pStyle w:val="NormalWeb"/>
+      </w:pPr>
+    </w:p>
+    <w:p/>
+    <w:p>
+      <w:pPr>
+        <w:pStyle w:val="Cabealho"/>
+        <w:rPr>
+          <w:b/>
+          <w:bCs/>
+        </w:rPr>
+      </w:pPr>
+    </w:p>
+    <w:p>
+      <w:pPr>
+        <w:pStyle w:val="Cabealho"/>
+        <w:rPr>
+          <w:b/>
+          <w:bCs/>
+        </w:rPr>
+      </w:pPr>
+    </w:p>
+    <w:p>
+      <w:pPr>
+        <w:pStyle w:val="Cabealho"/>
+        <w:rPr>
+          <w:b/>
+          <w:bCs/>
+        </w:rPr>
       </w:pPr>
     </w:p>
     <w:sectPr>
-      <w:headerReference w:type="default" r:id="rId8"/>
-      <w:footerReference w:type="default" r:id="rId9"/>
-      <w:headerReference w:type="first" r:id="rId10"/>
+      <w:headerReference w:type="even" r:id="rId8"/>
+      <w:headerReference w:type="default" r:id="rId9"/>
+      <w:footerReference w:type="even" r:id="rId10"/>
+      <w:footerReference w:type="default" r:id="rId11"/>
+      <w:headerReference w:type="first" r:id="rId12"/>
+      <w:footerReference w:type="first" r:id="rId13"/>
       <w:pgSz w:w="11906" w:h="16838"/>
       <w:pgMar w:top="1700" w:right="1133" w:bottom="1133" w:left="1700" w:header="0" w:footer="720" w:gutter="0"/>
       <w:pgNumType w:start="0"/>
@@ -1066,6 +1709,16 @@
 </file>
 
 <file path=word/footer1.xml><?xml version="1.0" encoding="utf-8"?>
+<w:ftr xmlns:wpc="http://schemas.microsoft.com/office/word/2010/wordprocessingCanvas" xmlns:cx="http://schemas.microsoft.com/office/drawing/2014/chartex" xmlns:cx1="http://schemas.microsoft.com/office/drawing/2015/9/8/chartex" xmlns:cx2="http://schemas.microsoft.com/office/drawing/2015/10/21/chartex" xmlns:cx3="http://schemas.microsoft.com/office/drawing/2016/5/9/chartex" xmlns:cx4="http://schemas.microsoft.com/office/drawing/2016/5/10/chartex" xmlns:cx5="http://schemas.microsoft.com/office/drawing/2016/5/11/chartex" xmlns:cx6="http://schemas.microsoft.com/office/drawing/2016/5/12/chartex" xmlns:cx7="http://schemas.microsoft.com/office/drawing/2016/5/13/chartex" xmlns:cx8="http://schemas.microsoft.com/office/drawing/2016/5/14/chartex" xmlns:mc="http://schemas.openxmlformats.org/markup-compatibility/2006" xmlns:aink="http://schemas.microsoft.com/office/drawing/2016/ink" xmlns:am3d="http://schemas.microsoft.com/office/drawing/2017/model3d" xmlns:o="urn:schemas-microsoft-com:office:office" xmlns:oel="http://schemas.microsoft.com/office/2019/extlst" xmlns:r="http://schemas.openxmlformats.org/officeDocument/2006/relationships" xmlns:m="http://schemas.openxmlformats.org/officeDocument/2006/math" xmlns:v="urn:schemas-microsoft-com:vml" xmlns:wp14="http://schemas.microsoft.com/office/word/2010/wordprocessingDrawing" xmlns:wp="http://schemas.openxmlformats.org/drawingml/2006/wordprocessingDrawing" xmlns:w10="urn:schemas-microsoft-com:office:word" xmlns:w="http://schemas.openxmlformats.org/wordprocessingml/2006/main" xmlns:w14="http://schemas.microsoft.com/office/word/2010/wordml" xmlns:w15="http://schemas.microsoft.com/office/word/2012/wordml" xmlns:w16cex="http://schemas.microsoft.com/office/word/2018/wordml/cex" xmlns:w16cid="http://schemas.microsoft.com/office/word/2016/wordml/cid" xmlns:w16="http://schemas.microsoft.com/office/word/2018/wordml" xmlns:w16sdtdh="http://schemas.microsoft.com/office/word/2020/wordml/sdtdatahash" xmlns:w16se="http://schemas.microsoft.com/office/word/2015/wordml/symex" xmlns:wpg="http://schemas.microsoft.com/office/word/2010/wordprocessingGroup" xmlns:wpi="http://schemas.microsoft.com/office/word/2010/wordprocessingInk" xmlns:wne="http://schemas.microsoft.com/office/word/2006/wordml" xmlns:wps="http://schemas.microsoft.com/office/word/2010/wordprocessingShape" mc:Ignorable="w14 w15 w16se w16cid w16 w16cex w16sdtdh wp14">
+  <w:p>
+    <w:pPr>
+      <w:pStyle w:val="Rodap"/>
+    </w:pPr>
+  </w:p>
+</w:ftr>
+</file>
+
+<file path=word/footer2.xml><?xml version="1.0" encoding="utf-8"?>
 <w:ftr xmlns:wpc="http://schemas.microsoft.com/office/word/2010/wordprocessingCanvas" xmlns:cx="http://schemas.microsoft.com/office/drawing/2014/chartex" xmlns:cx1="http://schemas.microsoft.com/office/drawing/2015/9/8/chartex" xmlns:cx2="http://schemas.microsoft.com/office/drawing/2015/10/21/chartex" xmlns:cx3="http://schemas.microsoft.com/office/drawing/2016/5/9/chartex" xmlns:cx4="http://schemas.microsoft.com/office/drawing/2016/5/10/chartex" xmlns:cx5="http://schemas.microsoft.com/office/drawing/2016/5/11/chartex" xmlns:cx6="http://schemas.microsoft.com/office/drawing/2016/5/12/chartex" xmlns:cx7="http://schemas.microsoft.com/office/drawing/2016/5/13/chartex" xmlns:cx8="http://schemas.microsoft.com/office/drawing/2016/5/14/chartex" xmlns:mc="http://schemas.openxmlformats.org/markup-compatibility/2006" xmlns:aink="http://schemas.microsoft.com/office/drawing/2016/ink" xmlns:am3d="http://schemas.microsoft.com/office/drawing/2017/model3d" xmlns:o="urn:schemas-microsoft-com:office:office" xmlns:oel="http://schemas.microsoft.com/office/2019/extlst" xmlns:r="http://schemas.openxmlformats.org/officeDocument/2006/relationships" xmlns:m="http://schemas.openxmlformats.org/officeDocument/2006/math" xmlns:v="urn:schemas-microsoft-com:vml" xmlns:wp14="http://schemas.microsoft.com/office/word/2010/wordprocessingDrawing" xmlns:wp="http://schemas.openxmlformats.org/drawingml/2006/wordprocessingDrawing" xmlns:w10="urn:schemas-microsoft-com:office:word" xmlns:w="http://schemas.openxmlformats.org/wordprocessingml/2006/main" xmlns:w14="http://schemas.microsoft.com/office/word/2010/wordml" xmlns:w15="http://schemas.microsoft.com/office/word/2012/wordml" xmlns:w16cex="http://schemas.microsoft.com/office/word/2018/wordml/cex" xmlns:w16cid="http://schemas.microsoft.com/office/word/2016/wordml/cid" xmlns:w16="http://schemas.microsoft.com/office/word/2018/wordml" xmlns:w16sdtdh="http://schemas.microsoft.com/office/word/2020/wordml/sdtdatahash" xmlns:w16se="http://schemas.microsoft.com/office/word/2015/wordml/symex" xmlns:wpg="http://schemas.microsoft.com/office/word/2010/wordprocessingGroup" xmlns:wpi="http://schemas.microsoft.com/office/word/2010/wordprocessingInk" xmlns:wne="http://schemas.microsoft.com/office/word/2006/wordml" xmlns:wps="http://schemas.microsoft.com/office/word/2010/wordprocessingShape" mc:Ignorable="w14 w15 w16se w16cid w16 w16cex w16sdtdh wp14">
   <w:p>
     <w:pPr>
@@ -1134,7 +1787,7 @@
         <w:sz w:val="18"/>
         <w:szCs w:val="18"/>
       </w:rPr>
-      <w:t>08</w:t>
+      <w:t>0</w:t>
     </w:r>
     <w:r>
       <w:rPr>
@@ -1142,6 +1795,14 @@
         <w:sz w:val="18"/>
         <w:szCs w:val="18"/>
       </w:rPr>
+      <w:t>5</w:t>
+    </w:r>
+    <w:r>
+      <w:rPr>
+        <w:color w:val="000000"/>
+        <w:sz w:val="18"/>
+        <w:szCs w:val="18"/>
+      </w:rPr>
       <w:t>/</w:t>
     </w:r>
     <w:r>
@@ -1150,7 +1811,15 @@
         <w:sz w:val="18"/>
         <w:szCs w:val="18"/>
       </w:rPr>
-      <w:t>11</w:t>
+      <w:t>1</w:t>
+    </w:r>
+    <w:r>
+      <w:rPr>
+        <w:color w:val="000000"/>
+        <w:sz w:val="18"/>
+        <w:szCs w:val="18"/>
+      </w:rPr>
+      <w:t>2</w:t>
     </w:r>
     <w:r>
       <w:rPr>
@@ -1195,6 +1864,16 @@
 </w:ftr>
 </file>
 
+<file path=word/footer3.xml><?xml version="1.0" encoding="utf-8"?>
+<w:ftr xmlns:wpc="http://schemas.microsoft.com/office/word/2010/wordprocessingCanvas" xmlns:cx="http://schemas.microsoft.com/office/drawing/2014/chartex" xmlns:cx1="http://schemas.microsoft.com/office/drawing/2015/9/8/chartex" xmlns:cx2="http://schemas.microsoft.com/office/drawing/2015/10/21/chartex" xmlns:cx3="http://schemas.microsoft.com/office/drawing/2016/5/9/chartex" xmlns:cx4="http://schemas.microsoft.com/office/drawing/2016/5/10/chartex" xmlns:cx5="http://schemas.microsoft.com/office/drawing/2016/5/11/chartex" xmlns:cx6="http://schemas.microsoft.com/office/drawing/2016/5/12/chartex" xmlns:cx7="http://schemas.microsoft.com/office/drawing/2016/5/13/chartex" xmlns:cx8="http://schemas.microsoft.com/office/drawing/2016/5/14/chartex" xmlns:mc="http://schemas.openxmlformats.org/markup-compatibility/2006" xmlns:aink="http://schemas.microsoft.com/office/drawing/2016/ink" xmlns:am3d="http://schemas.microsoft.com/office/drawing/2017/model3d" xmlns:o="urn:schemas-microsoft-com:office:office" xmlns:oel="http://schemas.microsoft.com/office/2019/extlst" xmlns:r="http://schemas.openxmlformats.org/officeDocument/2006/relationships" xmlns:m="http://schemas.openxmlformats.org/officeDocument/2006/math" xmlns:v="urn:schemas-microsoft-com:vml" xmlns:wp14="http://schemas.microsoft.com/office/word/2010/wordprocessingDrawing" xmlns:wp="http://schemas.openxmlformats.org/drawingml/2006/wordprocessingDrawing" xmlns:w10="urn:schemas-microsoft-com:office:word" xmlns:w="http://schemas.openxmlformats.org/wordprocessingml/2006/main" xmlns:w14="http://schemas.microsoft.com/office/word/2010/wordml" xmlns:w15="http://schemas.microsoft.com/office/word/2012/wordml" xmlns:w16cex="http://schemas.microsoft.com/office/word/2018/wordml/cex" xmlns:w16cid="http://schemas.microsoft.com/office/word/2016/wordml/cid" xmlns:w16="http://schemas.microsoft.com/office/word/2018/wordml" xmlns:w16sdtdh="http://schemas.microsoft.com/office/word/2020/wordml/sdtdatahash" xmlns:w16se="http://schemas.microsoft.com/office/word/2015/wordml/symex" xmlns:wpg="http://schemas.microsoft.com/office/word/2010/wordprocessingGroup" xmlns:wpi="http://schemas.microsoft.com/office/word/2010/wordprocessingInk" xmlns:wne="http://schemas.microsoft.com/office/word/2006/wordml" xmlns:wps="http://schemas.microsoft.com/office/word/2010/wordprocessingShape" mc:Ignorable="w14 w15 w16se w16cid w16 w16cex w16sdtdh wp14">
+  <w:p>
+    <w:pPr>
+      <w:pStyle w:val="Rodap"/>
+    </w:pPr>
+  </w:p>
+</w:ftr>
+</file>
+
 <file path=word/footnotes.xml><?xml version="1.0" encoding="utf-8"?>
 <w:footnotes xmlns:wpc="http://schemas.microsoft.com/office/word/2010/wordprocessingCanvas" xmlns:cx="http://schemas.microsoft.com/office/drawing/2014/chartex" xmlns:cx1="http://schemas.microsoft.com/office/drawing/2015/9/8/chartex" xmlns:cx2="http://schemas.microsoft.com/office/drawing/2015/10/21/chartex" xmlns:cx3="http://schemas.microsoft.com/office/drawing/2016/5/9/chartex" xmlns:cx4="http://schemas.microsoft.com/office/drawing/2016/5/10/chartex" xmlns:cx5="http://schemas.microsoft.com/office/drawing/2016/5/11/chartex" xmlns:cx6="http://schemas.microsoft.com/office/drawing/2016/5/12/chartex" xmlns:cx7="http://schemas.microsoft.com/office/drawing/2016/5/13/chartex" xmlns:cx8="http://schemas.microsoft.com/office/drawing/2016/5/14/chartex" xmlns:mc="http://schemas.openxmlformats.org/markup-compatibility/2006" xmlns:aink="http://schemas.microsoft.com/office/drawing/2016/ink" xmlns:am3d="http://schemas.microsoft.com/office/drawing/2017/model3d" xmlns:o="urn:schemas-microsoft-com:office:office" xmlns:oel="http://schemas.microsoft.com/office/2019/extlst" xmlns:r="http://schemas.openxmlformats.org/officeDocument/2006/relationships" xmlns:m="http://schemas.openxmlformats.org/officeDocument/2006/math" xmlns:v="urn:schemas-microsoft-com:vml" xmlns:wp14="http://schemas.microsoft.com/office/word/2010/wordprocessingDrawing" xmlns:wp="http://schemas.openxmlformats.org/drawingml/2006/wordprocessingDrawing" xmlns:w10="urn:schemas-microsoft-com:office:word" xmlns:w="http://schemas.openxmlformats.org/wordprocessingml/2006/main" xmlns:w14="http://schemas.microsoft.com/office/word/2010/wordml" xmlns:w15="http://schemas.microsoft.com/office/word/2012/wordml" xmlns:w16cex="http://schemas.microsoft.com/office/word/2018/wordml/cex" xmlns:w16cid="http://schemas.microsoft.com/office/word/2016/wordml/cid" xmlns:w16="http://schemas.microsoft.com/office/word/2018/wordml" xmlns:w16sdtdh="http://schemas.microsoft.com/office/word/2020/wordml/sdtdatahash" xmlns:w16se="http://schemas.microsoft.com/office/word/2015/wordml/symex" xmlns:wpg="http://schemas.microsoft.com/office/word/2010/wordprocessingGroup" xmlns:wpi="http://schemas.microsoft.com/office/word/2010/wordprocessingInk" xmlns:wne="http://schemas.microsoft.com/office/word/2006/wordml" xmlns:wps="http://schemas.microsoft.com/office/word/2010/wordprocessingShape" mc:Ignorable="w14 w15 w16se w16cid w16 w16cex w16sdtdh wp14">
   <w:footnote w:type="separator" w:id="-1">
@@ -1221,6 +1900,16 @@
 </file>
 
 <file path=word/header1.xml><?xml version="1.0" encoding="utf-8"?>
+<w:hdr xmlns:wpc="http://schemas.microsoft.com/office/word/2010/wordprocessingCanvas" xmlns:cx="http://schemas.microsoft.com/office/drawing/2014/chartex" xmlns:cx1="http://schemas.microsoft.com/office/drawing/2015/9/8/chartex" xmlns:cx2="http://schemas.microsoft.com/office/drawing/2015/10/21/chartex" xmlns:cx3="http://schemas.microsoft.com/office/drawing/2016/5/9/chartex" xmlns:cx4="http://schemas.microsoft.com/office/drawing/2016/5/10/chartex" xmlns:cx5="http://schemas.microsoft.com/office/drawing/2016/5/11/chartex" xmlns:cx6="http://schemas.microsoft.com/office/drawing/2016/5/12/chartex" xmlns:cx7="http://schemas.microsoft.com/office/drawing/2016/5/13/chartex" xmlns:cx8="http://schemas.microsoft.com/office/drawing/2016/5/14/chartex" xmlns:mc="http://schemas.openxmlformats.org/markup-compatibility/2006" xmlns:aink="http://schemas.microsoft.com/office/drawing/2016/ink" xmlns:am3d="http://schemas.microsoft.com/office/drawing/2017/model3d" xmlns:o="urn:schemas-microsoft-com:office:office" xmlns:oel="http://schemas.microsoft.com/office/2019/extlst" xmlns:r="http://schemas.openxmlformats.org/officeDocument/2006/relationships" xmlns:m="http://schemas.openxmlformats.org/officeDocument/2006/math" xmlns:v="urn:schemas-microsoft-com:vml" xmlns:wp14="http://schemas.microsoft.com/office/word/2010/wordprocessingDrawing" xmlns:wp="http://schemas.openxmlformats.org/drawingml/2006/wordprocessingDrawing" xmlns:w10="urn:schemas-microsoft-com:office:word" xmlns:w="http://schemas.openxmlformats.org/wordprocessingml/2006/main" xmlns:w14="http://schemas.microsoft.com/office/word/2010/wordml" xmlns:w15="http://schemas.microsoft.com/office/word/2012/wordml" xmlns:w16cex="http://schemas.microsoft.com/office/word/2018/wordml/cex" xmlns:w16cid="http://schemas.microsoft.com/office/word/2016/wordml/cid" xmlns:w16="http://schemas.microsoft.com/office/word/2018/wordml" xmlns:w16sdtdh="http://schemas.microsoft.com/office/word/2020/wordml/sdtdatahash" xmlns:w16se="http://schemas.microsoft.com/office/word/2015/wordml/symex" xmlns:wpg="http://schemas.microsoft.com/office/word/2010/wordprocessingGroup" xmlns:wpi="http://schemas.microsoft.com/office/word/2010/wordprocessingInk" xmlns:wne="http://schemas.microsoft.com/office/word/2006/wordml" xmlns:wps="http://schemas.microsoft.com/office/word/2010/wordprocessingShape" mc:Ignorable="w14 w15 w16se w16cid w16 w16cex w16sdtdh wp14">
+  <w:p>
+    <w:pPr>
+      <w:pStyle w:val="Cabealho"/>
+    </w:pPr>
+  </w:p>
+</w:hdr>
+</file>
+
+<file path=word/header2.xml><?xml version="1.0" encoding="utf-8"?>
 <w:hdr xmlns:wpc="http://schemas.microsoft.com/office/word/2010/wordprocessingCanvas" xmlns:cx="http://schemas.microsoft.com/office/drawing/2014/chartex" xmlns:cx1="http://schemas.microsoft.com/office/drawing/2015/9/8/chartex" xmlns:cx2="http://schemas.microsoft.com/office/drawing/2015/10/21/chartex" xmlns:cx3="http://schemas.microsoft.com/office/drawing/2016/5/9/chartex" xmlns:cx4="http://schemas.microsoft.com/office/drawing/2016/5/10/chartex" xmlns:cx5="http://schemas.microsoft.com/office/drawing/2016/5/11/chartex" xmlns:cx6="http://schemas.microsoft.com/office/drawing/2016/5/12/chartex" xmlns:cx7="http://schemas.microsoft.com/office/drawing/2016/5/13/chartex" xmlns:cx8="http://schemas.microsoft.com/office/drawing/2016/5/14/chartex" xmlns:mc="http://schemas.openxmlformats.org/markup-compatibility/2006" xmlns:aink="http://schemas.microsoft.com/office/drawing/2016/ink" xmlns:am3d="http://schemas.microsoft.com/office/drawing/2017/model3d" xmlns:o="urn:schemas-microsoft-com:office:office" xmlns:oel="http://schemas.microsoft.com/office/2019/extlst" xmlns:r="http://schemas.openxmlformats.org/officeDocument/2006/relationships" xmlns:m="http://schemas.openxmlformats.org/officeDocument/2006/math" xmlns:v="urn:schemas-microsoft-com:vml" xmlns:wp14="http://schemas.microsoft.com/office/word/2010/wordprocessingDrawing" xmlns:wp="http://schemas.openxmlformats.org/drawingml/2006/wordprocessingDrawing" xmlns:w10="urn:schemas-microsoft-com:office:word" xmlns:w="http://schemas.openxmlformats.org/wordprocessingml/2006/main" xmlns:w14="http://schemas.microsoft.com/office/word/2010/wordml" xmlns:w15="http://schemas.microsoft.com/office/word/2012/wordml" xmlns:w16cex="http://schemas.microsoft.com/office/word/2018/wordml/cex" xmlns:w16cid="http://schemas.microsoft.com/office/word/2016/wordml/cid" xmlns:w16="http://schemas.microsoft.com/office/word/2018/wordml" xmlns:w16sdtdh="http://schemas.microsoft.com/office/word/2020/wordml/sdtdatahash" xmlns:w16se="http://schemas.microsoft.com/office/word/2015/wordml/symex" xmlns:wpg="http://schemas.microsoft.com/office/word/2010/wordprocessingGroup" xmlns:wpi="http://schemas.microsoft.com/office/word/2010/wordprocessingInk" xmlns:wne="http://schemas.microsoft.com/office/word/2006/wordml" xmlns:wps="http://schemas.microsoft.com/office/word/2010/wordprocessingShape" mc:Ignorable="w14 w15 w16se w16cid w16 w16cex w16sdtdh wp14">
   <w:p>
     <w:pPr>
@@ -1708,7 +2397,7 @@
 </w:hdr>
 </file>
 
-<file path=word/header2.xml><?xml version="1.0" encoding="utf-8"?>
+<file path=word/header3.xml><?xml version="1.0" encoding="utf-8"?>
 <w:hdr xmlns:wpc="http://schemas.microsoft.com/office/word/2010/wordprocessingCanvas" xmlns:cx="http://schemas.microsoft.com/office/drawing/2014/chartex" xmlns:cx1="http://schemas.microsoft.com/office/drawing/2015/9/8/chartex" xmlns:cx2="http://schemas.microsoft.com/office/drawing/2015/10/21/chartex" xmlns:cx3="http://schemas.microsoft.com/office/drawing/2016/5/9/chartex" xmlns:cx4="http://schemas.microsoft.com/office/drawing/2016/5/10/chartex" xmlns:cx5="http://schemas.microsoft.com/office/drawing/2016/5/11/chartex" xmlns:cx6="http://schemas.microsoft.com/office/drawing/2016/5/12/chartex" xmlns:cx7="http://schemas.microsoft.com/office/drawing/2016/5/13/chartex" xmlns:cx8="http://schemas.microsoft.com/office/drawing/2016/5/14/chartex" xmlns:mc="http://schemas.openxmlformats.org/markup-compatibility/2006" xmlns:aink="http://schemas.microsoft.com/office/drawing/2016/ink" xmlns:am3d="http://schemas.microsoft.com/office/drawing/2017/model3d" xmlns:o="urn:schemas-microsoft-com:office:office" xmlns:oel="http://schemas.microsoft.com/office/2019/extlst" xmlns:r="http://schemas.openxmlformats.org/officeDocument/2006/relationships" xmlns:m="http://schemas.openxmlformats.org/officeDocument/2006/math" xmlns:v="urn:schemas-microsoft-com:vml" xmlns:wp14="http://schemas.microsoft.com/office/word/2010/wordprocessingDrawing" xmlns:wp="http://schemas.openxmlformats.org/drawingml/2006/wordprocessingDrawing" xmlns:w10="urn:schemas-microsoft-com:office:word" xmlns:w="http://schemas.openxmlformats.org/wordprocessingml/2006/main" xmlns:w14="http://schemas.microsoft.com/office/word/2010/wordml" xmlns:w15="http://schemas.microsoft.com/office/word/2012/wordml" xmlns:w16cex="http://schemas.microsoft.com/office/word/2018/wordml/cex" xmlns:w16cid="http://schemas.microsoft.com/office/word/2016/wordml/cid" xmlns:w16="http://schemas.microsoft.com/office/word/2018/wordml" xmlns:w16sdtdh="http://schemas.microsoft.com/office/word/2020/wordml/sdtdatahash" xmlns:w16se="http://schemas.microsoft.com/office/word/2015/wordml/symex" xmlns:wpg="http://schemas.microsoft.com/office/word/2010/wordprocessingGroup" xmlns:wpi="http://schemas.microsoft.com/office/word/2010/wordprocessingInk" xmlns:wne="http://schemas.microsoft.com/office/word/2006/wordml" xmlns:wps="http://schemas.microsoft.com/office/word/2010/wordprocessingShape" mc:Ignorable="w14 w15 w16se w16cid w16 w16cex w16sdtdh wp14">
   <w:p>
     <w:pPr>
@@ -1864,6 +2553,155 @@
     </w:lvl>
   </w:abstractNum>
   <w:abstractNum w:abstractNumId="1" w15:restartNumberingAfterBreak="0">
+    <w:nsid w:val="06D0116B"/>
+    <w:multiLevelType w:val="multilevel"/>
+    <w:tmpl w:val="ED8CDD46"/>
+    <w:lvl w:ilvl="0">
+      <w:start w:val="1"/>
+      <w:numFmt w:val="bullet"/>
+      <w:lvlText w:val=""/>
+      <w:lvlJc w:val="left"/>
+      <w:pPr>
+        <w:tabs>
+          <w:tab w:val="num" w:pos="720"/>
+        </w:tabs>
+        <w:ind w:left="720" w:hanging="360"/>
+      </w:pPr>
+      <w:rPr>
+        <w:rFonts w:ascii="Symbol" w:hAnsi="Symbol" w:hint="default"/>
+        <w:sz w:val="20"/>
+      </w:rPr>
+    </w:lvl>
+    <w:lvl w:ilvl="1" w:tentative="1">
+      <w:start w:val="1"/>
+      <w:numFmt w:val="bullet"/>
+      <w:lvlText w:val=""/>
+      <w:lvlJc w:val="left"/>
+      <w:pPr>
+        <w:tabs>
+          <w:tab w:val="num" w:pos="1440"/>
+        </w:tabs>
+        <w:ind w:left="1440" w:hanging="360"/>
+      </w:pPr>
+      <w:rPr>
+        <w:rFonts w:ascii="Symbol" w:hAnsi="Symbol" w:hint="default"/>
+        <w:sz w:val="20"/>
+      </w:rPr>
+    </w:lvl>
+    <w:lvl w:ilvl="2" w:tentative="1">
+      <w:start w:val="1"/>
+      <w:numFmt w:val="bullet"/>
+      <w:lvlText w:val=""/>
+      <w:lvlJc w:val="left"/>
+      <w:pPr>
+        <w:tabs>
+          <w:tab w:val="num" w:pos="2160"/>
+        </w:tabs>
+        <w:ind w:left="2160" w:hanging="360"/>
+      </w:pPr>
+      <w:rPr>
+        <w:rFonts w:ascii="Symbol" w:hAnsi="Symbol" w:hint="default"/>
+        <w:sz w:val="20"/>
+      </w:rPr>
+    </w:lvl>
+    <w:lvl w:ilvl="3" w:tentative="1">
+      <w:start w:val="1"/>
+      <w:numFmt w:val="bullet"/>
+      <w:lvlText w:val=""/>
+      <w:lvlJc w:val="left"/>
+      <w:pPr>
+        <w:tabs>
+          <w:tab w:val="num" w:pos="2880"/>
+        </w:tabs>
+        <w:ind w:left="2880" w:hanging="360"/>
+      </w:pPr>
+      <w:rPr>
+        <w:rFonts w:ascii="Symbol" w:hAnsi="Symbol" w:hint="default"/>
+        <w:sz w:val="20"/>
+      </w:rPr>
+    </w:lvl>
+    <w:lvl w:ilvl="4" w:tentative="1">
+      <w:start w:val="1"/>
+      <w:numFmt w:val="bullet"/>
+      <w:lvlText w:val=""/>
+      <w:lvlJc w:val="left"/>
+      <w:pPr>
+        <w:tabs>
+          <w:tab w:val="num" w:pos="3600"/>
+        </w:tabs>
+        <w:ind w:left="3600" w:hanging="360"/>
+      </w:pPr>
+      <w:rPr>
+        <w:rFonts w:ascii="Symbol" w:hAnsi="Symbol" w:hint="default"/>
+        <w:sz w:val="20"/>
+      </w:rPr>
+    </w:lvl>
+    <w:lvl w:ilvl="5" w:tentative="1">
+      <w:start w:val="1"/>
+      <w:numFmt w:val="bullet"/>
+      <w:lvlText w:val=""/>
+      <w:lvlJc w:val="left"/>
+      <w:pPr>
+        <w:tabs>
+          <w:tab w:val="num" w:pos="4320"/>
+        </w:tabs>
+        <w:ind w:left="4320" w:hanging="360"/>
+      </w:pPr>
+      <w:rPr>
+        <w:rFonts w:ascii="Symbol" w:hAnsi="Symbol" w:hint="default"/>
+        <w:sz w:val="20"/>
+      </w:rPr>
+    </w:lvl>
+    <w:lvl w:ilvl="6" w:tentative="1">
+      <w:start w:val="1"/>
+      <w:numFmt w:val="bullet"/>
+      <w:lvlText w:val=""/>
+      <w:lvlJc w:val="left"/>
+      <w:pPr>
+        <w:tabs>
+          <w:tab w:val="num" w:pos="5040"/>
+        </w:tabs>
+        <w:ind w:left="5040" w:hanging="360"/>
+      </w:pPr>
+      <w:rPr>
+        <w:rFonts w:ascii="Symbol" w:hAnsi="Symbol" w:hint="default"/>
+        <w:sz w:val="20"/>
+      </w:rPr>
+    </w:lvl>
+    <w:lvl w:ilvl="7" w:tentative="1">
+      <w:start w:val="1"/>
+      <w:numFmt w:val="bullet"/>
+      <w:lvlText w:val=""/>
+      <w:lvlJc w:val="left"/>
+      <w:pPr>
+        <w:tabs>
+          <w:tab w:val="num" w:pos="5760"/>
+        </w:tabs>
+        <w:ind w:left="5760" w:hanging="360"/>
+      </w:pPr>
+      <w:rPr>
+        <w:rFonts w:ascii="Symbol" w:hAnsi="Symbol" w:hint="default"/>
+        <w:sz w:val="20"/>
+      </w:rPr>
+    </w:lvl>
+    <w:lvl w:ilvl="8" w:tentative="1">
+      <w:start w:val="1"/>
+      <w:numFmt w:val="bullet"/>
+      <w:lvlText w:val=""/>
+      <w:lvlJc w:val="left"/>
+      <w:pPr>
+        <w:tabs>
+          <w:tab w:val="num" w:pos="6480"/>
+        </w:tabs>
+        <w:ind w:left="6480" w:hanging="360"/>
+      </w:pPr>
+      <w:rPr>
+        <w:rFonts w:ascii="Symbol" w:hAnsi="Symbol" w:hint="default"/>
+        <w:sz w:val="20"/>
+      </w:rPr>
+    </w:lvl>
+  </w:abstractNum>
+  <w:abstractNum w:abstractNumId="2" w15:restartNumberingAfterBreak="0">
     <w:nsid w:val="0B7957F6"/>
     <w:multiLevelType w:val="multilevel"/>
     <w:tmpl w:val="8676F206"/>
@@ -1976,7 +2814,120 @@
       </w:rPr>
     </w:lvl>
   </w:abstractNum>
-  <w:abstractNum w:abstractNumId="2" w15:restartNumberingAfterBreak="0">
+  <w:abstractNum w:abstractNumId="3" w15:restartNumberingAfterBreak="0">
+    <w:nsid w:val="0C391CE8"/>
+    <w:multiLevelType w:val="multilevel"/>
+    <w:tmpl w:val="62DC09B8"/>
+    <w:lvl w:ilvl="0">
+      <w:start w:val="1"/>
+      <w:numFmt w:val="decimal"/>
+      <w:lvlText w:val="%1."/>
+      <w:lvlJc w:val="left"/>
+      <w:pPr>
+        <w:tabs>
+          <w:tab w:val="num" w:pos="720"/>
+        </w:tabs>
+        <w:ind w:left="720" w:hanging="360"/>
+      </w:pPr>
+    </w:lvl>
+    <w:lvl w:ilvl="1" w:tentative="1">
+      <w:start w:val="1"/>
+      <w:numFmt w:val="decimal"/>
+      <w:lvlText w:val="%2."/>
+      <w:lvlJc w:val="left"/>
+      <w:pPr>
+        <w:tabs>
+          <w:tab w:val="num" w:pos="1440"/>
+        </w:tabs>
+        <w:ind w:left="1440" w:hanging="360"/>
+      </w:pPr>
+    </w:lvl>
+    <w:lvl w:ilvl="2" w:tentative="1">
+      <w:start w:val="1"/>
+      <w:numFmt w:val="decimal"/>
+      <w:lvlText w:val="%3."/>
+      <w:lvlJc w:val="left"/>
+      <w:pPr>
+        <w:tabs>
+          <w:tab w:val="num" w:pos="2160"/>
+        </w:tabs>
+        <w:ind w:left="2160" w:hanging="360"/>
+      </w:pPr>
+    </w:lvl>
+    <w:lvl w:ilvl="3" w:tentative="1">
+      <w:start w:val="1"/>
+      <w:numFmt w:val="decimal"/>
+      <w:lvlText w:val="%4."/>
+      <w:lvlJc w:val="left"/>
+      <w:pPr>
+        <w:tabs>
+          <w:tab w:val="num" w:pos="2880"/>
+        </w:tabs>
+        <w:ind w:left="2880" w:hanging="360"/>
+      </w:pPr>
+    </w:lvl>
+    <w:lvl w:ilvl="4" w:tentative="1">
+      <w:start w:val="1"/>
+      <w:numFmt w:val="decimal"/>
+      <w:lvlText w:val="%5."/>
+      <w:lvlJc w:val="left"/>
+      <w:pPr>
+        <w:tabs>
+          <w:tab w:val="num" w:pos="3600"/>
+        </w:tabs>
+        <w:ind w:left="3600" w:hanging="360"/>
+      </w:pPr>
+    </w:lvl>
+    <w:lvl w:ilvl="5" w:tentative="1">
+      <w:start w:val="1"/>
+      <w:numFmt w:val="decimal"/>
+      <w:lvlText w:val="%6."/>
+      <w:lvlJc w:val="left"/>
+      <w:pPr>
+        <w:tabs>
+          <w:tab w:val="num" w:pos="4320"/>
+        </w:tabs>
+        <w:ind w:left="4320" w:hanging="360"/>
+      </w:pPr>
+    </w:lvl>
+    <w:lvl w:ilvl="6" w:tentative="1">
+      <w:start w:val="1"/>
+      <w:numFmt w:val="decimal"/>
+      <w:lvlText w:val="%7."/>
+      <w:lvlJc w:val="left"/>
+      <w:pPr>
+        <w:tabs>
+          <w:tab w:val="num" w:pos="5040"/>
+        </w:tabs>
+        <w:ind w:left="5040" w:hanging="360"/>
+      </w:pPr>
+    </w:lvl>
+    <w:lvl w:ilvl="7" w:tentative="1">
+      <w:start w:val="1"/>
+      <w:numFmt w:val="decimal"/>
+      <w:lvlText w:val="%8."/>
+      <w:lvlJc w:val="left"/>
+      <w:pPr>
+        <w:tabs>
+          <w:tab w:val="num" w:pos="5760"/>
+        </w:tabs>
+        <w:ind w:left="5760" w:hanging="360"/>
+      </w:pPr>
+    </w:lvl>
+    <w:lvl w:ilvl="8" w:tentative="1">
+      <w:start w:val="1"/>
+      <w:numFmt w:val="decimal"/>
+      <w:lvlText w:val="%9."/>
+      <w:lvlJc w:val="left"/>
+      <w:pPr>
+        <w:tabs>
+          <w:tab w:val="num" w:pos="6480"/>
+        </w:tabs>
+        <w:ind w:left="6480" w:hanging="360"/>
+      </w:pPr>
+    </w:lvl>
+  </w:abstractNum>
+  <w:abstractNum w:abstractNumId="4" w15:restartNumberingAfterBreak="0">
     <w:nsid w:val="13ED3201"/>
     <w:multiLevelType w:val="hybridMultilevel"/>
     <w:tmpl w:val="0FC42B68"/>
@@ -2089,7 +3040,7 @@
       </w:rPr>
     </w:lvl>
   </w:abstractNum>
-  <w:abstractNum w:abstractNumId="3" w15:restartNumberingAfterBreak="0">
+  <w:abstractNum w:abstractNumId="5" w15:restartNumberingAfterBreak="0">
     <w:nsid w:val="13EE51DE"/>
     <w:multiLevelType w:val="multilevel"/>
     <w:tmpl w:val="13B089FA"/>
@@ -2238,7 +3189,7 @@
       </w:rPr>
     </w:lvl>
   </w:abstractNum>
-  <w:abstractNum w:abstractNumId="4" w15:restartNumberingAfterBreak="0">
+  <w:abstractNum w:abstractNumId="6" w15:restartNumberingAfterBreak="0">
     <w:nsid w:val="15BC0B63"/>
     <w:multiLevelType w:val="multilevel"/>
     <w:tmpl w:val="EC90FB9E"/>
@@ -2351,7 +3302,7 @@
       </w:pPr>
     </w:lvl>
   </w:abstractNum>
-  <w:abstractNum w:abstractNumId="5" w15:restartNumberingAfterBreak="0">
+  <w:abstractNum w:abstractNumId="7" w15:restartNumberingAfterBreak="0">
     <w:nsid w:val="16585F53"/>
     <w:multiLevelType w:val="hybridMultilevel"/>
     <w:tmpl w:val="495838B8"/>
@@ -2464,7 +3415,7 @@
       </w:rPr>
     </w:lvl>
   </w:abstractNum>
-  <w:abstractNum w:abstractNumId="6" w15:restartNumberingAfterBreak="0">
+  <w:abstractNum w:abstractNumId="8" w15:restartNumberingAfterBreak="0">
     <w:nsid w:val="199D439E"/>
     <w:multiLevelType w:val="multilevel"/>
     <w:tmpl w:val="ADBC750C"/>
@@ -2613,7 +3564,7 @@
       </w:rPr>
     </w:lvl>
   </w:abstractNum>
-  <w:abstractNum w:abstractNumId="7" w15:restartNumberingAfterBreak="0">
+  <w:abstractNum w:abstractNumId="9" w15:restartNumberingAfterBreak="0">
     <w:nsid w:val="1E611DFC"/>
     <w:multiLevelType w:val="multilevel"/>
     <w:tmpl w:val="0582AC56"/>
@@ -2762,7 +3713,7 @@
       </w:rPr>
     </w:lvl>
   </w:abstractNum>
-  <w:abstractNum w:abstractNumId="8" w15:restartNumberingAfterBreak="0">
+  <w:abstractNum w:abstractNumId="10" w15:restartNumberingAfterBreak="0">
     <w:nsid w:val="26FE0A4B"/>
     <w:multiLevelType w:val="multilevel"/>
     <w:tmpl w:val="23E0C764"/>
@@ -2875,7 +3826,7 @@
       </w:pPr>
     </w:lvl>
   </w:abstractNum>
-  <w:abstractNum w:abstractNumId="9" w15:restartNumberingAfterBreak="0">
+  <w:abstractNum w:abstractNumId="11" w15:restartNumberingAfterBreak="0">
     <w:nsid w:val="2C493708"/>
     <w:multiLevelType w:val="multilevel"/>
     <w:tmpl w:val="F17EFAC2"/>
@@ -3024,7 +3975,7 @@
       </w:rPr>
     </w:lvl>
   </w:abstractNum>
-  <w:abstractNum w:abstractNumId="10" w15:restartNumberingAfterBreak="0">
+  <w:abstractNum w:abstractNumId="12" w15:restartNumberingAfterBreak="0">
     <w:nsid w:val="36E2363E"/>
     <w:multiLevelType w:val="multilevel"/>
     <w:tmpl w:val="4CBADFC4"/>
@@ -3173,7 +4124,7 @@
       </w:rPr>
     </w:lvl>
   </w:abstractNum>
-  <w:abstractNum w:abstractNumId="11" w15:restartNumberingAfterBreak="0">
+  <w:abstractNum w:abstractNumId="13" w15:restartNumberingAfterBreak="0">
     <w:nsid w:val="38AD15AA"/>
     <w:multiLevelType w:val="multilevel"/>
     <w:tmpl w:val="A4C6C104"/>
@@ -3322,7 +4273,7 @@
       </w:rPr>
     </w:lvl>
   </w:abstractNum>
-  <w:abstractNum w:abstractNumId="12" w15:restartNumberingAfterBreak="0">
+  <w:abstractNum w:abstractNumId="14" w15:restartNumberingAfterBreak="0">
     <w:nsid w:val="40250D89"/>
     <w:multiLevelType w:val="multilevel"/>
     <w:tmpl w:val="F176DA98"/>
@@ -3435,7 +4386,7 @@
       </w:pPr>
     </w:lvl>
   </w:abstractNum>
-  <w:abstractNum w:abstractNumId="13" w15:restartNumberingAfterBreak="0">
+  <w:abstractNum w:abstractNumId="15" w15:restartNumberingAfterBreak="0">
     <w:nsid w:val="4230776A"/>
     <w:multiLevelType w:val="multilevel"/>
     <w:tmpl w:val="D05ABFC6"/>
@@ -3548,7 +4499,156 @@
       </w:rPr>
     </w:lvl>
   </w:abstractNum>
-  <w:abstractNum w:abstractNumId="14" w15:restartNumberingAfterBreak="0">
+  <w:abstractNum w:abstractNumId="16" w15:restartNumberingAfterBreak="0">
+    <w:nsid w:val="43B11D7B"/>
+    <w:multiLevelType w:val="multilevel"/>
+    <w:tmpl w:val="53B0F59E"/>
+    <w:lvl w:ilvl="0">
+      <w:start w:val="1"/>
+      <w:numFmt w:val="bullet"/>
+      <w:lvlText w:val=""/>
+      <w:lvlJc w:val="left"/>
+      <w:pPr>
+        <w:tabs>
+          <w:tab w:val="num" w:pos="720"/>
+        </w:tabs>
+        <w:ind w:left="720" w:hanging="360"/>
+      </w:pPr>
+      <w:rPr>
+        <w:rFonts w:ascii="Symbol" w:hAnsi="Symbol" w:hint="default"/>
+        <w:sz w:val="20"/>
+      </w:rPr>
+    </w:lvl>
+    <w:lvl w:ilvl="1" w:tentative="1">
+      <w:start w:val="1"/>
+      <w:numFmt w:val="bullet"/>
+      <w:lvlText w:val=""/>
+      <w:lvlJc w:val="left"/>
+      <w:pPr>
+        <w:tabs>
+          <w:tab w:val="num" w:pos="1440"/>
+        </w:tabs>
+        <w:ind w:left="1440" w:hanging="360"/>
+      </w:pPr>
+      <w:rPr>
+        <w:rFonts w:ascii="Symbol" w:hAnsi="Symbol" w:hint="default"/>
+        <w:sz w:val="20"/>
+      </w:rPr>
+    </w:lvl>
+    <w:lvl w:ilvl="2" w:tentative="1">
+      <w:start w:val="1"/>
+      <w:numFmt w:val="bullet"/>
+      <w:lvlText w:val=""/>
+      <w:lvlJc w:val="left"/>
+      <w:pPr>
+        <w:tabs>
+          <w:tab w:val="num" w:pos="2160"/>
+        </w:tabs>
+        <w:ind w:left="2160" w:hanging="360"/>
+      </w:pPr>
+      <w:rPr>
+        <w:rFonts w:ascii="Symbol" w:hAnsi="Symbol" w:hint="default"/>
+        <w:sz w:val="20"/>
+      </w:rPr>
+    </w:lvl>
+    <w:lvl w:ilvl="3" w:tentative="1">
+      <w:start w:val="1"/>
+      <w:numFmt w:val="bullet"/>
+      <w:lvlText w:val=""/>
+      <w:lvlJc w:val="left"/>
+      <w:pPr>
+        <w:tabs>
+          <w:tab w:val="num" w:pos="2880"/>
+        </w:tabs>
+        <w:ind w:left="2880" w:hanging="360"/>
+      </w:pPr>
+      <w:rPr>
+        <w:rFonts w:ascii="Symbol" w:hAnsi="Symbol" w:hint="default"/>
+        <w:sz w:val="20"/>
+      </w:rPr>
+    </w:lvl>
+    <w:lvl w:ilvl="4" w:tentative="1">
+      <w:start w:val="1"/>
+      <w:numFmt w:val="bullet"/>
+      <w:lvlText w:val=""/>
+      <w:lvlJc w:val="left"/>
+      <w:pPr>
+        <w:tabs>
+          <w:tab w:val="num" w:pos="3600"/>
+        </w:tabs>
+        <w:ind w:left="3600" w:hanging="360"/>
+      </w:pPr>
+      <w:rPr>
+        <w:rFonts w:ascii="Symbol" w:hAnsi="Symbol" w:hint="default"/>
+        <w:sz w:val="20"/>
+      </w:rPr>
+    </w:lvl>
+    <w:lvl w:ilvl="5" w:tentative="1">
+      <w:start w:val="1"/>
+      <w:numFmt w:val="bullet"/>
+      <w:lvlText w:val=""/>
+      <w:lvlJc w:val="left"/>
+      <w:pPr>
+        <w:tabs>
+          <w:tab w:val="num" w:pos="4320"/>
+        </w:tabs>
+        <w:ind w:left="4320" w:hanging="360"/>
+      </w:pPr>
+      <w:rPr>
+        <w:rFonts w:ascii="Symbol" w:hAnsi="Symbol" w:hint="default"/>
+        <w:sz w:val="20"/>
+      </w:rPr>
+    </w:lvl>
+    <w:lvl w:ilvl="6" w:tentative="1">
+      <w:start w:val="1"/>
+      <w:numFmt w:val="bullet"/>
+      <w:lvlText w:val=""/>
+      <w:lvlJc w:val="left"/>
+      <w:pPr>
+        <w:tabs>
+          <w:tab w:val="num" w:pos="5040"/>
+        </w:tabs>
+        <w:ind w:left="5040" w:hanging="360"/>
+      </w:pPr>
+      <w:rPr>
+        <w:rFonts w:ascii="Symbol" w:hAnsi="Symbol" w:hint="default"/>
+        <w:sz w:val="20"/>
+      </w:rPr>
+    </w:lvl>
+    <w:lvl w:ilvl="7" w:tentative="1">
+      <w:start w:val="1"/>
+      <w:numFmt w:val="bullet"/>
+      <w:lvlText w:val=""/>
+      <w:lvlJc w:val="left"/>
+      <w:pPr>
+        <w:tabs>
+          <w:tab w:val="num" w:pos="5760"/>
+        </w:tabs>
+        <w:ind w:left="5760" w:hanging="360"/>
+      </w:pPr>
+      <w:rPr>
+        <w:rFonts w:ascii="Symbol" w:hAnsi="Symbol" w:hint="default"/>
+        <w:sz w:val="20"/>
+      </w:rPr>
+    </w:lvl>
+    <w:lvl w:ilvl="8" w:tentative="1">
+      <w:start w:val="1"/>
+      <w:numFmt w:val="bullet"/>
+      <w:lvlText w:val=""/>
+      <w:lvlJc w:val="left"/>
+      <w:pPr>
+        <w:tabs>
+          <w:tab w:val="num" w:pos="6480"/>
+        </w:tabs>
+        <w:ind w:left="6480" w:hanging="360"/>
+      </w:pPr>
+      <w:rPr>
+        <w:rFonts w:ascii="Symbol" w:hAnsi="Symbol" w:hint="default"/>
+        <w:sz w:val="20"/>
+      </w:rPr>
+    </w:lvl>
+  </w:abstractNum>
+  <w:abstractNum w:abstractNumId="17" w15:restartNumberingAfterBreak="0">
     <w:nsid w:val="529A2836"/>
     <w:multiLevelType w:val="multilevel"/>
     <w:tmpl w:val="96862982"/>
@@ -3697,7 +4797,7 @@
       </w:rPr>
     </w:lvl>
   </w:abstractNum>
-  <w:abstractNum w:abstractNumId="15" w15:restartNumberingAfterBreak="0">
+  <w:abstractNum w:abstractNumId="18" w15:restartNumberingAfterBreak="0">
     <w:nsid w:val="59321043"/>
     <w:multiLevelType w:val="multilevel"/>
     <w:tmpl w:val="03EE1F9A"/>
@@ -3810,7 +4910,120 @@
       </w:pPr>
     </w:lvl>
   </w:abstractNum>
-  <w:abstractNum w:abstractNumId="16" w15:restartNumberingAfterBreak="0">
+  <w:abstractNum w:abstractNumId="19" w15:restartNumberingAfterBreak="0">
+    <w:nsid w:val="6EC54852"/>
+    <w:multiLevelType w:val="multilevel"/>
+    <w:tmpl w:val="58C040EC"/>
+    <w:lvl w:ilvl="0">
+      <w:start w:val="1"/>
+      <w:numFmt w:val="decimal"/>
+      <w:lvlText w:val="%1."/>
+      <w:lvlJc w:val="left"/>
+      <w:pPr>
+        <w:tabs>
+          <w:tab w:val="num" w:pos="720"/>
+        </w:tabs>
+        <w:ind w:left="720" w:hanging="360"/>
+      </w:pPr>
+    </w:lvl>
+    <w:lvl w:ilvl="1" w:tentative="1">
+      <w:start w:val="1"/>
+      <w:numFmt w:val="decimal"/>
+      <w:lvlText w:val="%2."/>
+      <w:lvlJc w:val="left"/>
+      <w:pPr>
+        <w:tabs>
+          <w:tab w:val="num" w:pos="1440"/>
+        </w:tabs>
+        <w:ind w:left="1440" w:hanging="360"/>
+      </w:pPr>
+    </w:lvl>
+    <w:lvl w:ilvl="2" w:tentative="1">
+      <w:start w:val="1"/>
+      <w:numFmt w:val="decimal"/>
+      <w:lvlText w:val="%3."/>
+      <w:lvlJc w:val="left"/>
+      <w:pPr>
+        <w:tabs>
+          <w:tab w:val="num" w:pos="2160"/>
+        </w:tabs>
+        <w:ind w:left="2160" w:hanging="360"/>
+      </w:pPr>
+    </w:lvl>
+    <w:lvl w:ilvl="3" w:tentative="1">
+      <w:start w:val="1"/>
+      <w:numFmt w:val="decimal"/>
+      <w:lvlText w:val="%4."/>
+      <w:lvlJc w:val="left"/>
+      <w:pPr>
+        <w:tabs>
+          <w:tab w:val="num" w:pos="2880"/>
+        </w:tabs>
+        <w:ind w:left="2880" w:hanging="360"/>
+      </w:pPr>
+    </w:lvl>
+    <w:lvl w:ilvl="4" w:tentative="1">
+      <w:start w:val="1"/>
+      <w:numFmt w:val="decimal"/>
+      <w:lvlText w:val="%5."/>
+      <w:lvlJc w:val="left"/>
+      <w:pPr>
+        <w:tabs>
+          <w:tab w:val="num" w:pos="3600"/>
+        </w:tabs>
+        <w:ind w:left="3600" w:hanging="360"/>
+      </w:pPr>
+    </w:lvl>
+    <w:lvl w:ilvl="5" w:tentative="1">
+      <w:start w:val="1"/>
+      <w:numFmt w:val="decimal"/>
+      <w:lvlText w:val="%6."/>
+      <w:lvlJc w:val="left"/>
+      <w:pPr>
+        <w:tabs>
+          <w:tab w:val="num" w:pos="4320"/>
+        </w:tabs>
+        <w:ind w:left="4320" w:hanging="360"/>
+      </w:pPr>
+    </w:lvl>
+    <w:lvl w:ilvl="6" w:tentative="1">
+      <w:start w:val="1"/>
+      <w:numFmt w:val="decimal"/>
+      <w:lvlText w:val="%7."/>
+      <w:lvlJc w:val="left"/>
+      <w:pPr>
+        <w:tabs>
+          <w:tab w:val="num" w:pos="5040"/>
+        </w:tabs>
+        <w:ind w:left="5040" w:hanging="360"/>
+      </w:pPr>
+    </w:lvl>
+    <w:lvl w:ilvl="7" w:tentative="1">
+      <w:start w:val="1"/>
+      <w:numFmt w:val="decimal"/>
+      <w:lvlText w:val="%8."/>
+      <w:lvlJc w:val="left"/>
+      <w:pPr>
+        <w:tabs>
+          <w:tab w:val="num" w:pos="5760"/>
+        </w:tabs>
+        <w:ind w:left="5760" w:hanging="360"/>
+      </w:pPr>
+    </w:lvl>
+    <w:lvl w:ilvl="8" w:tentative="1">
+      <w:start w:val="1"/>
+      <w:numFmt w:val="decimal"/>
+      <w:lvlText w:val="%9."/>
+      <w:lvlJc w:val="left"/>
+      <w:pPr>
+        <w:tabs>
+          <w:tab w:val="num" w:pos="6480"/>
+        </w:tabs>
+        <w:ind w:left="6480" w:hanging="360"/>
+      </w:pPr>
+    </w:lvl>
+  </w:abstractNum>
+  <w:abstractNum w:abstractNumId="20" w15:restartNumberingAfterBreak="0">
     <w:nsid w:val="75231657"/>
     <w:multiLevelType w:val="hybridMultilevel"/>
     <w:tmpl w:val="DBB8D046"/>
@@ -3923,7 +5136,7 @@
       </w:rPr>
     </w:lvl>
   </w:abstractNum>
-  <w:abstractNum w:abstractNumId="17" w15:restartNumberingAfterBreak="0">
+  <w:abstractNum w:abstractNumId="21" w15:restartNumberingAfterBreak="0">
     <w:nsid w:val="774C713D"/>
     <w:multiLevelType w:val="multilevel"/>
     <w:tmpl w:val="04C6667A"/>
@@ -4072,7 +5285,7 @@
       </w:rPr>
     </w:lvl>
   </w:abstractNum>
-  <w:abstractNum w:abstractNumId="18" w15:restartNumberingAfterBreak="0">
+  <w:abstractNum w:abstractNumId="22" w15:restartNumberingAfterBreak="0">
     <w:nsid w:val="77507E57"/>
     <w:multiLevelType w:val="multilevel"/>
     <w:tmpl w:val="3F60BE2E"/>
@@ -4185,7 +5398,7 @@
       </w:rPr>
     </w:lvl>
   </w:abstractNum>
-  <w:abstractNum w:abstractNumId="19" w15:restartNumberingAfterBreak="0">
+  <w:abstractNum w:abstractNumId="23" w15:restartNumberingAfterBreak="0">
     <w:nsid w:val="7AC361DC"/>
     <w:multiLevelType w:val="hybridMultilevel"/>
     <w:tmpl w:val="17D22ADE"/>
@@ -4271,65 +5484,193 @@
       </w:pPr>
     </w:lvl>
   </w:abstractNum>
+  <w:abstractNum w:abstractNumId="24" w15:restartNumberingAfterBreak="0">
+    <w:nsid w:val="7D794BB0"/>
+    <w:multiLevelType w:val="multilevel"/>
+    <w:tmpl w:val="CBFE6014"/>
+    <w:lvl w:ilvl="0">
+      <w:start w:val="1"/>
+      <w:numFmt w:val="decimal"/>
+      <w:lvlText w:val="%1."/>
+      <w:lvlJc w:val="left"/>
+      <w:pPr>
+        <w:tabs>
+          <w:tab w:val="num" w:pos="720"/>
+        </w:tabs>
+        <w:ind w:left="720" w:hanging="360"/>
+      </w:pPr>
+    </w:lvl>
+    <w:lvl w:ilvl="1" w:tentative="1">
+      <w:start w:val="1"/>
+      <w:numFmt w:val="decimal"/>
+      <w:lvlText w:val="%2."/>
+      <w:lvlJc w:val="left"/>
+      <w:pPr>
+        <w:tabs>
+          <w:tab w:val="num" w:pos="1440"/>
+        </w:tabs>
+        <w:ind w:left="1440" w:hanging="360"/>
+      </w:pPr>
+    </w:lvl>
+    <w:lvl w:ilvl="2" w:tentative="1">
+      <w:start w:val="1"/>
+      <w:numFmt w:val="decimal"/>
+      <w:lvlText w:val="%3."/>
+      <w:lvlJc w:val="left"/>
+      <w:pPr>
+        <w:tabs>
+          <w:tab w:val="num" w:pos="2160"/>
+        </w:tabs>
+        <w:ind w:left="2160" w:hanging="360"/>
+      </w:pPr>
+    </w:lvl>
+    <w:lvl w:ilvl="3" w:tentative="1">
+      <w:start w:val="1"/>
+      <w:numFmt w:val="decimal"/>
+      <w:lvlText w:val="%4."/>
+      <w:lvlJc w:val="left"/>
+      <w:pPr>
+        <w:tabs>
+          <w:tab w:val="num" w:pos="2880"/>
+        </w:tabs>
+        <w:ind w:left="2880" w:hanging="360"/>
+      </w:pPr>
+    </w:lvl>
+    <w:lvl w:ilvl="4" w:tentative="1">
+      <w:start w:val="1"/>
+      <w:numFmt w:val="decimal"/>
+      <w:lvlText w:val="%5."/>
+      <w:lvlJc w:val="left"/>
+      <w:pPr>
+        <w:tabs>
+          <w:tab w:val="num" w:pos="3600"/>
+        </w:tabs>
+        <w:ind w:left="3600" w:hanging="360"/>
+      </w:pPr>
+    </w:lvl>
+    <w:lvl w:ilvl="5" w:tentative="1">
+      <w:start w:val="1"/>
+      <w:numFmt w:val="decimal"/>
+      <w:lvlText w:val="%6."/>
+      <w:lvlJc w:val="left"/>
+      <w:pPr>
+        <w:tabs>
+          <w:tab w:val="num" w:pos="4320"/>
+        </w:tabs>
+        <w:ind w:left="4320" w:hanging="360"/>
+      </w:pPr>
+    </w:lvl>
+    <w:lvl w:ilvl="6" w:tentative="1">
+      <w:start w:val="1"/>
+      <w:numFmt w:val="decimal"/>
+      <w:lvlText w:val="%7."/>
+      <w:lvlJc w:val="left"/>
+      <w:pPr>
+        <w:tabs>
+          <w:tab w:val="num" w:pos="5040"/>
+        </w:tabs>
+        <w:ind w:left="5040" w:hanging="360"/>
+      </w:pPr>
+    </w:lvl>
+    <w:lvl w:ilvl="7" w:tentative="1">
+      <w:start w:val="1"/>
+      <w:numFmt w:val="decimal"/>
+      <w:lvlText w:val="%8."/>
+      <w:lvlJc w:val="left"/>
+      <w:pPr>
+        <w:tabs>
+          <w:tab w:val="num" w:pos="5760"/>
+        </w:tabs>
+        <w:ind w:left="5760" w:hanging="360"/>
+      </w:pPr>
+    </w:lvl>
+    <w:lvl w:ilvl="8" w:tentative="1">
+      <w:start w:val="1"/>
+      <w:numFmt w:val="decimal"/>
+      <w:lvlText w:val="%9."/>
+      <w:lvlJc w:val="left"/>
+      <w:pPr>
+        <w:tabs>
+          <w:tab w:val="num" w:pos="6480"/>
+        </w:tabs>
+        <w:ind w:left="6480" w:hanging="360"/>
+      </w:pPr>
+    </w:lvl>
+  </w:abstractNum>
   <w:num w:numId="1" w16cid:durableId="631255882">
-    <w:abstractNumId w:val="1"/>
+    <w:abstractNumId w:val="2"/>
   </w:num>
   <w:num w:numId="2" w16cid:durableId="397559584">
+    <w:abstractNumId w:val="15"/>
+  </w:num>
+  <w:num w:numId="3" w16cid:durableId="725378493">
+    <w:abstractNumId w:val="22"/>
+  </w:num>
+  <w:num w:numId="4" w16cid:durableId="2133865065">
+    <w:abstractNumId w:val="4"/>
+  </w:num>
+  <w:num w:numId="5" w16cid:durableId="1984655351">
+    <w:abstractNumId w:val="8"/>
+  </w:num>
+  <w:num w:numId="6" w16cid:durableId="1496535355">
+    <w:abstractNumId w:val="11"/>
+  </w:num>
+  <w:num w:numId="7" w16cid:durableId="1561867745">
+    <w:abstractNumId w:val="5"/>
+  </w:num>
+  <w:num w:numId="8" w16cid:durableId="750201910">
     <w:abstractNumId w:val="13"/>
   </w:num>
-  <w:num w:numId="3" w16cid:durableId="725378493">
+  <w:num w:numId="9" w16cid:durableId="1604534457">
+    <w:abstractNumId w:val="17"/>
+  </w:num>
+  <w:num w:numId="10" w16cid:durableId="1470246900">
+    <w:abstractNumId w:val="14"/>
+  </w:num>
+  <w:num w:numId="11" w16cid:durableId="1574580060">
     <w:abstractNumId w:val="18"/>
   </w:num>
-  <w:num w:numId="4" w16cid:durableId="2133865065">
-    <w:abstractNumId w:val="2"/>
-  </w:num>
-  <w:num w:numId="5" w16cid:durableId="1984655351">
-    <w:abstractNumId w:val="6"/>
-  </w:num>
-  <w:num w:numId="6" w16cid:durableId="1496535355">
-    <w:abstractNumId w:val="9"/>
-  </w:num>
-  <w:num w:numId="7" w16cid:durableId="1561867745">
-    <w:abstractNumId w:val="3"/>
-  </w:num>
-  <w:num w:numId="8" w16cid:durableId="750201910">
-    <w:abstractNumId w:val="11"/>
-  </w:num>
-  <w:num w:numId="9" w16cid:durableId="1604534457">
-    <w:abstractNumId w:val="14"/>
-  </w:num>
-  <w:num w:numId="10" w16cid:durableId="1470246900">
-    <w:abstractNumId w:val="12"/>
-  </w:num>
-  <w:num w:numId="11" w16cid:durableId="1574580060">
-    <w:abstractNumId w:val="15"/>
-  </w:num>
   <w:num w:numId="12" w16cid:durableId="2016760276">
-    <w:abstractNumId w:val="8"/>
+    <w:abstractNumId w:val="10"/>
   </w:num>
   <w:num w:numId="13" w16cid:durableId="1916619691">
     <w:abstractNumId w:val="0"/>
   </w:num>
   <w:num w:numId="14" w16cid:durableId="1429229965">
-    <w:abstractNumId w:val="4"/>
+    <w:abstractNumId w:val="6"/>
   </w:num>
   <w:num w:numId="15" w16cid:durableId="1444421365">
-    <w:abstractNumId w:val="17"/>
+    <w:abstractNumId w:val="21"/>
   </w:num>
   <w:num w:numId="16" w16cid:durableId="1615284772">
-    <w:abstractNumId w:val="5"/>
+    <w:abstractNumId w:val="7"/>
   </w:num>
   <w:num w:numId="17" w16cid:durableId="1261377763">
+    <w:abstractNumId w:val="20"/>
+  </w:num>
+  <w:num w:numId="18" w16cid:durableId="85079630">
+    <w:abstractNumId w:val="23"/>
+  </w:num>
+  <w:num w:numId="19" w16cid:durableId="2073385933">
+    <w:abstractNumId w:val="12"/>
+  </w:num>
+  <w:num w:numId="20" w16cid:durableId="2088333840">
+    <w:abstractNumId w:val="9"/>
+  </w:num>
+  <w:num w:numId="21" w16cid:durableId="880551503">
     <w:abstractNumId w:val="16"/>
   </w:num>
-  <w:num w:numId="18" w16cid:durableId="85079630">
+  <w:num w:numId="22" w16cid:durableId="2046590127">
     <w:abstractNumId w:val="19"/>
   </w:num>
-  <w:num w:numId="19" w16cid:durableId="2073385933">
-    <w:abstractNumId w:val="10"/>
+  <w:num w:numId="23" w16cid:durableId="955062270">
+    <w:abstractNumId w:val="1"/>
   </w:num>
-  <w:num w:numId="20" w16cid:durableId="2088333840">
-    <w:abstractNumId w:val="7"/>
+  <w:num w:numId="24" w16cid:durableId="279608835">
+    <w:abstractNumId w:val="3"/>
+  </w:num>
+  <w:num w:numId="25" w16cid:durableId="506942530">
+    <w:abstractNumId w:val="24"/>
   </w:num>
 </w:numbering>
 </file>
@@ -5129,6 +6470,19 @@
       <w:szCs w:val="24"/>
     </w:rPr>
   </w:style>
+  <w:style w:type="paragraph" w:customStyle="1" w:styleId="text-base">
+    <w:name w:val="text-base"/>
+    <w:basedOn w:val="Normal"/>
+    <w:rsid w:val="00097051"/>
+    <w:pPr>
+      <w:spacing w:before="100" w:beforeAutospacing="1" w:after="100" w:afterAutospacing="1" w:line="240" w:lineRule="auto"/>
+    </w:pPr>
+    <w:rPr>
+      <w:rFonts w:ascii="Times New Roman" w:eastAsia="Times New Roman" w:hAnsi="Times New Roman" w:cs="Times New Roman"/>
+      <w:sz w:val="24"/>
+      <w:szCs w:val="24"/>
+    </w:rPr>
+  </w:style>
 </w:styles>
 </file>
 

</xml_diff>